<commit_message>
Documentations and updates. Web client config changes
</commit_message>
<xml_diff>
--- a/Documentation/Savr_App Software Design Document Ver. 0.1.docx
+++ b/Documentation/Savr_App Software Design Document Ver. 0.1.docx
@@ -25,24 +25,7 @@
         <w:pStyle w:val="Heading1"/>
         <w:jc w:val="center"/>
         <w:rPr>
-          <w:color w:val="000000" w:themeColor="text1"/>
-        </w:rPr>
-      </w:pPr>
-    </w:p>
-    <w:p>
-      <w:pPr>
-        <w:pStyle w:val="Heading1"/>
-        <w:jc w:val="center"/>
-        <w:rPr>
-          <w:color w:val="000000" w:themeColor="text1"/>
-        </w:rPr>
-      </w:pPr>
-    </w:p>
-    <w:p>
-      <w:pPr>
-        <w:pStyle w:val="Heading1"/>
-        <w:jc w:val="center"/>
-        <w:rPr>
+          <w:noProof/>
           <w:color w:val="000000" w:themeColor="text1"/>
         </w:rPr>
       </w:pPr>
@@ -68,27 +51,90 @@
     </w:p>
     <w:p>
       <w:pPr>
+        <w:pStyle w:val="Heading1"/>
+        <w:jc w:val="center"/>
+        <w:rPr>
+          <w:color w:val="000000" w:themeColor="text1"/>
+        </w:rPr>
+      </w:pPr>
+      <w:r>
+        <w:rPr>
+          <w:noProof/>
+          <w:color w:val="000000" w:themeColor="text1"/>
+        </w:rPr>
+        <w:drawing>
+          <wp:inline distT="0" distB="0" distL="0" distR="0" wp14:anchorId="4B59C70B" wp14:editId="61DC8523">
+            <wp:extent cx="2826038" cy="2743009"/>
+            <wp:effectExtent l="0" t="0" r="0" b="635"/>
+            <wp:docPr id="2" name="Picture 2"/>
+            <wp:cNvGraphicFramePr>
+              <a:graphicFrameLocks xmlns:a="http://schemas.openxmlformats.org/drawingml/2006/main" noChangeAspect="1"/>
+            </wp:cNvGraphicFramePr>
+            <a:graphic xmlns:a="http://schemas.openxmlformats.org/drawingml/2006/main">
+              <a:graphicData uri="http://schemas.openxmlformats.org/drawingml/2006/picture">
+                <pic:pic xmlns:pic="http://schemas.openxmlformats.org/drawingml/2006/picture">
+                  <pic:nvPicPr>
+                    <pic:cNvPr id="2" name="Picture 2"/>
+                    <pic:cNvPicPr/>
+                  </pic:nvPicPr>
+                  <pic:blipFill rotWithShape="1">
+                    <a:blip r:embed="rId6">
+                      <a:extLst>
+                        <a:ext uri="{28A0092B-C50C-407E-A947-70E740481C1C}">
+                          <a14:useLocalDpi xmlns:a14="http://schemas.microsoft.com/office/drawing/2010/main" val="0"/>
+                        </a:ext>
+                      </a:extLst>
+                    </a:blip>
+                    <a:srcRect l="24244" r="24242"/>
+                    <a:stretch/>
+                  </pic:blipFill>
+                  <pic:spPr bwMode="auto">
+                    <a:xfrm>
+                      <a:off x="0" y="0"/>
+                      <a:ext cx="2826235" cy="2743200"/>
+                    </a:xfrm>
+                    <a:prstGeom prst="rect">
+                      <a:avLst/>
+                    </a:prstGeom>
+                    <a:ln>
+                      <a:noFill/>
+                    </a:ln>
+                    <a:extLst>
+                      <a:ext uri="{53640926-AAD7-44D8-BBD7-CCE9431645EC}">
+                        <a14:shadowObscured xmlns:a14="http://schemas.microsoft.com/office/drawing/2010/main"/>
+                      </a:ext>
+                    </a:extLst>
+                  </pic:spPr>
+                </pic:pic>
+              </a:graphicData>
+            </a:graphic>
+          </wp:inline>
+        </w:drawing>
+      </w:r>
+    </w:p>
+    <w:p>
+      <w:pPr>
         <w:pStyle w:val="Heading2"/>
         <w:jc w:val="center"/>
         <w:rPr>
           <w:color w:val="000000" w:themeColor="text1"/>
-          <w:sz w:val="28"/>
-          <w:szCs w:val="28"/>
+          <w:sz w:val="44"/>
+          <w:szCs w:val="44"/>
         </w:rPr>
       </w:pPr>
       <w:r>
         <w:rPr>
           <w:color w:val="000000" w:themeColor="text1"/>
-          <w:sz w:val="28"/>
-          <w:szCs w:val="28"/>
+          <w:sz w:val="44"/>
+          <w:szCs w:val="44"/>
         </w:rPr>
         <w:t>Savr</w:t>
       </w:r>
       <w:r>
         <w:rPr>
           <w:color w:val="000000" w:themeColor="text1"/>
-          <w:sz w:val="28"/>
-          <w:szCs w:val="28"/>
+          <w:sz w:val="44"/>
+          <w:szCs w:val="44"/>
         </w:rPr>
         <w:t xml:space="preserve"> - Personal Finance Tracker</w:t>
       </w:r>
@@ -110,19 +156,7 @@
         <w:rPr>
           <w:color w:val="000000" w:themeColor="text1"/>
         </w:rPr>
-        <w:t>0</w:t>
-      </w:r>
-      <w:r>
-        <w:rPr>
-          <w:color w:val="000000" w:themeColor="text1"/>
-        </w:rPr>
-        <w:t>.</w:t>
-      </w:r>
-      <w:r>
-        <w:rPr>
-          <w:color w:val="000000" w:themeColor="text1"/>
-        </w:rPr>
-        <w:t>1</w:t>
+        <w:t>1.0</w:t>
       </w:r>
     </w:p>
     <w:p>
@@ -1090,9 +1124,86 @@
       <w:pPr>
         <w:spacing w:after="0"/>
       </w:pPr>
-      <w:r>
-        <w:t>• User registration and login</w:t>
-      </w:r>
+    </w:p>
+    <w:p>
+      <w:pPr>
+        <w:spacing w:after="0"/>
+      </w:pPr>
+      <w:r>
+        <w:t xml:space="preserve">• </w:t>
+      </w:r>
+      <w:r>
+        <w:t>View a summary dashboard showing</w:t>
+      </w:r>
+      <w:r>
+        <w:t xml:space="preserve"> total income, total expenses, savings</w:t>
+      </w:r>
+    </w:p>
+    <w:p>
+      <w:pPr>
+        <w:spacing w:after="0"/>
+      </w:pPr>
+    </w:p>
+    <w:p>
+      <w:pPr>
+        <w:spacing w:after="0"/>
+      </w:pPr>
+      <w:r>
+        <w:rPr>
+          <w:noProof/>
+        </w:rPr>
+        <w:drawing>
+          <wp:inline distT="0" distB="0" distL="0" distR="0" wp14:anchorId="6490A3CD" wp14:editId="66870513">
+            <wp:extent cx="6063685" cy="2888673"/>
+            <wp:effectExtent l="0" t="0" r="0" b="6985"/>
+            <wp:docPr id="3" name="Picture 3"/>
+            <wp:cNvGraphicFramePr>
+              <a:graphicFrameLocks xmlns:a="http://schemas.openxmlformats.org/drawingml/2006/main" noChangeAspect="1"/>
+            </wp:cNvGraphicFramePr>
+            <a:graphic xmlns:a="http://schemas.openxmlformats.org/drawingml/2006/main">
+              <a:graphicData uri="http://schemas.openxmlformats.org/drawingml/2006/picture">
+                <pic:pic xmlns:pic="http://schemas.openxmlformats.org/drawingml/2006/picture">
+                  <pic:nvPicPr>
+                    <pic:cNvPr id="3" name="Picture 3"/>
+                    <pic:cNvPicPr/>
+                  </pic:nvPicPr>
+                  <pic:blipFill>
+                    <a:blip r:embed="rId7" cstate="print">
+                      <a:extLst>
+                        <a:ext uri="{28A0092B-C50C-407E-A947-70E740481C1C}">
+                          <a14:useLocalDpi xmlns:a14="http://schemas.microsoft.com/office/drawing/2010/main" val="0"/>
+                        </a:ext>
+                      </a:extLst>
+                    </a:blip>
+                    <a:stretch>
+                      <a:fillRect/>
+                    </a:stretch>
+                  </pic:blipFill>
+                  <pic:spPr>
+                    <a:xfrm>
+                      <a:off x="0" y="0"/>
+                      <a:ext cx="6078318" cy="2895644"/>
+                    </a:xfrm>
+                    <a:prstGeom prst="rect">
+                      <a:avLst/>
+                    </a:prstGeom>
+                  </pic:spPr>
+                </pic:pic>
+              </a:graphicData>
+            </a:graphic>
+          </wp:inline>
+        </w:drawing>
+      </w:r>
+    </w:p>
+    <w:p>
+      <w:pPr>
+        <w:spacing w:after="0"/>
+      </w:pPr>
+    </w:p>
+    <w:p>
+      <w:pPr>
+        <w:spacing w:after="0"/>
+      </w:pPr>
       <w:r>
         <w:br/>
         <w:t>• Add, edit, and delete income entries</w:t>
@@ -1102,22 +1213,416 @@
       <w:pPr>
         <w:spacing w:after="0"/>
       </w:pPr>
+    </w:p>
+    <w:p>
+      <w:pPr>
+        <w:spacing w:after="0"/>
+      </w:pPr>
+      <w:r>
+        <w:rPr>
+          <w:noProof/>
+        </w:rPr>
+        <w:drawing>
+          <wp:inline distT="0" distB="0" distL="0" distR="0" wp14:anchorId="35307EEC" wp14:editId="5E0C1E48">
+            <wp:extent cx="5996587" cy="2909455"/>
+            <wp:effectExtent l="0" t="0" r="4445" b="5715"/>
+            <wp:docPr id="4" name="Picture 4"/>
+            <wp:cNvGraphicFramePr>
+              <a:graphicFrameLocks xmlns:a="http://schemas.openxmlformats.org/drawingml/2006/main" noChangeAspect="1"/>
+            </wp:cNvGraphicFramePr>
+            <a:graphic xmlns:a="http://schemas.openxmlformats.org/drawingml/2006/main">
+              <a:graphicData uri="http://schemas.openxmlformats.org/drawingml/2006/picture">
+                <pic:pic xmlns:pic="http://schemas.openxmlformats.org/drawingml/2006/picture">
+                  <pic:nvPicPr>
+                    <pic:cNvPr id="4" name="Picture 4"/>
+                    <pic:cNvPicPr/>
+                  </pic:nvPicPr>
+                  <pic:blipFill>
+                    <a:blip r:embed="rId8" cstate="print">
+                      <a:extLst>
+                        <a:ext uri="{28A0092B-C50C-407E-A947-70E740481C1C}">
+                          <a14:useLocalDpi xmlns:a14="http://schemas.microsoft.com/office/drawing/2010/main" val="0"/>
+                        </a:ext>
+                      </a:extLst>
+                    </a:blip>
+                    <a:stretch>
+                      <a:fillRect/>
+                    </a:stretch>
+                  </pic:blipFill>
+                  <pic:spPr>
+                    <a:xfrm>
+                      <a:off x="0" y="0"/>
+                      <a:ext cx="6017911" cy="2919801"/>
+                    </a:xfrm>
+                    <a:prstGeom prst="rect">
+                      <a:avLst/>
+                    </a:prstGeom>
+                  </pic:spPr>
+                </pic:pic>
+              </a:graphicData>
+            </a:graphic>
+          </wp:inline>
+        </w:drawing>
+      </w:r>
+    </w:p>
+    <w:p>
+      <w:pPr>
+        <w:spacing w:after="0"/>
+      </w:pPr>
+    </w:p>
+    <w:p>
+      <w:pPr>
+        <w:spacing w:after="0"/>
+      </w:pPr>
+    </w:p>
+    <w:p>
+      <w:pPr>
+        <w:spacing w:after="0"/>
+      </w:pPr>
+    </w:p>
+    <w:p>
+      <w:pPr>
+        <w:spacing w:after="0"/>
+      </w:pPr>
+    </w:p>
+    <w:p>
+      <w:pPr>
+        <w:pStyle w:val="ListParagraph"/>
+        <w:numPr>
+          <w:ilvl w:val="0"/>
+          <w:numId w:val="1"/>
+        </w:numPr>
+        <w:spacing w:after="0"/>
+        <w:ind w:left="360"/>
+      </w:pPr>
+      <w:r>
+        <w:lastRenderedPageBreak/>
+        <w:t>Add Income / Funds</w:t>
+      </w:r>
+    </w:p>
+    <w:p>
+      <w:pPr>
+        <w:pStyle w:val="ListParagraph"/>
+        <w:spacing w:after="0"/>
+        <w:ind w:left="360"/>
+      </w:pPr>
+    </w:p>
+    <w:p>
+      <w:pPr>
+        <w:spacing w:after="0"/>
+      </w:pPr>
+      <w:r>
+        <w:rPr>
+          <w:noProof/>
+        </w:rPr>
+        <w:drawing>
+          <wp:inline distT="0" distB="0" distL="0" distR="0" wp14:anchorId="64E8B45C" wp14:editId="46233B93">
+            <wp:extent cx="5939664" cy="3345873"/>
+            <wp:effectExtent l="0" t="0" r="4445" b="6985"/>
+            <wp:docPr id="5" name="Picture 5"/>
+            <wp:cNvGraphicFramePr>
+              <a:graphicFrameLocks xmlns:a="http://schemas.openxmlformats.org/drawingml/2006/main" noChangeAspect="1"/>
+            </wp:cNvGraphicFramePr>
+            <a:graphic xmlns:a="http://schemas.openxmlformats.org/drawingml/2006/main">
+              <a:graphicData uri="http://schemas.openxmlformats.org/drawingml/2006/picture">
+                <pic:pic xmlns:pic="http://schemas.openxmlformats.org/drawingml/2006/picture">
+                  <pic:nvPicPr>
+                    <pic:cNvPr id="5" name="Picture 5"/>
+                    <pic:cNvPicPr/>
+                  </pic:nvPicPr>
+                  <pic:blipFill>
+                    <a:blip r:embed="rId9" cstate="print">
+                      <a:extLst>
+                        <a:ext uri="{28A0092B-C50C-407E-A947-70E740481C1C}">
+                          <a14:useLocalDpi xmlns:a14="http://schemas.microsoft.com/office/drawing/2010/main" val="0"/>
+                        </a:ext>
+                      </a:extLst>
+                    </a:blip>
+                    <a:stretch>
+                      <a:fillRect/>
+                    </a:stretch>
+                  </pic:blipFill>
+                  <pic:spPr>
+                    <a:xfrm>
+                      <a:off x="0" y="0"/>
+                      <a:ext cx="5948027" cy="3350584"/>
+                    </a:xfrm>
+                    <a:prstGeom prst="rect">
+                      <a:avLst/>
+                    </a:prstGeom>
+                  </pic:spPr>
+                </pic:pic>
+              </a:graphicData>
+            </a:graphic>
+          </wp:inline>
+        </w:drawing>
+      </w:r>
+    </w:p>
+    <w:p>
+      <w:pPr>
+        <w:spacing w:after="0"/>
+      </w:pPr>
+    </w:p>
+    <w:p>
+      <w:pPr>
+        <w:spacing w:after="0"/>
+      </w:pPr>
+    </w:p>
+    <w:p>
+      <w:pPr>
+        <w:spacing w:after="0"/>
+      </w:pPr>
+    </w:p>
+    <w:p>
+      <w:pPr>
+        <w:spacing w:after="0"/>
+      </w:pPr>
       <w:r>
         <w:t>• Add, edit, and delete expense entries</w:t>
       </w:r>
     </w:p>
     <w:p>
-      <w:r>
-        <w:t xml:space="preserve">• </w:t>
-      </w:r>
-      <w:r>
-        <w:t>View a summary dashboard showing</w:t>
-      </w:r>
-      <w:r>
-        <w:t xml:space="preserve"> total income, total expenses, savings</w:t>
-      </w:r>
-      <w:r>
-        <w:br/>
+      <w:pPr>
+        <w:spacing w:after="0"/>
+      </w:pPr>
+    </w:p>
+    <w:p>
+      <w:pPr>
+        <w:spacing w:after="0"/>
+      </w:pPr>
+      <w:r>
+        <w:rPr>
+          <w:noProof/>
+        </w:rPr>
+        <w:drawing>
+          <wp:inline distT="0" distB="0" distL="0" distR="0" wp14:anchorId="2AB84DB5" wp14:editId="1115BE5A">
+            <wp:extent cx="5940250" cy="2840182"/>
+            <wp:effectExtent l="0" t="0" r="3810" b="0"/>
+            <wp:docPr id="6" name="Picture 6"/>
+            <wp:cNvGraphicFramePr>
+              <a:graphicFrameLocks xmlns:a="http://schemas.openxmlformats.org/drawingml/2006/main" noChangeAspect="1"/>
+            </wp:cNvGraphicFramePr>
+            <a:graphic xmlns:a="http://schemas.openxmlformats.org/drawingml/2006/main">
+              <a:graphicData uri="http://schemas.openxmlformats.org/drawingml/2006/picture">
+                <pic:pic xmlns:pic="http://schemas.openxmlformats.org/drawingml/2006/picture">
+                  <pic:nvPicPr>
+                    <pic:cNvPr id="6" name="Picture 6"/>
+                    <pic:cNvPicPr/>
+                  </pic:nvPicPr>
+                  <pic:blipFill>
+                    <a:blip r:embed="rId10" cstate="print">
+                      <a:extLst>
+                        <a:ext uri="{28A0092B-C50C-407E-A947-70E740481C1C}">
+                          <a14:useLocalDpi xmlns:a14="http://schemas.microsoft.com/office/drawing/2010/main" val="0"/>
+                        </a:ext>
+                      </a:extLst>
+                    </a:blip>
+                    <a:stretch>
+                      <a:fillRect/>
+                    </a:stretch>
+                  </pic:blipFill>
+                  <pic:spPr>
+                    <a:xfrm>
+                      <a:off x="0" y="0"/>
+                      <a:ext cx="5954184" cy="2846844"/>
+                    </a:xfrm>
+                    <a:prstGeom prst="rect">
+                      <a:avLst/>
+                    </a:prstGeom>
+                  </pic:spPr>
+                </pic:pic>
+              </a:graphicData>
+            </a:graphic>
+          </wp:inline>
+        </w:drawing>
+      </w:r>
+    </w:p>
+    <w:p>
+      <w:pPr>
+        <w:spacing w:after="0"/>
+      </w:pPr>
+    </w:p>
+    <w:p>
+      <w:pPr>
+        <w:spacing w:after="0"/>
+      </w:pPr>
+    </w:p>
+    <w:p>
+      <w:pPr>
+        <w:spacing w:after="0"/>
+      </w:pPr>
+    </w:p>
+    <w:p>
+      <w:pPr>
+        <w:pStyle w:val="ListParagraph"/>
+        <w:numPr>
+          <w:ilvl w:val="0"/>
+          <w:numId w:val="1"/>
+        </w:numPr>
+        <w:spacing w:after="0"/>
+        <w:ind w:left="360"/>
+      </w:pPr>
+      <w:r>
+        <w:lastRenderedPageBreak/>
+        <w:t>Add Expense</w:t>
+      </w:r>
+    </w:p>
+    <w:p>
+      <w:pPr>
+        <w:spacing w:after="0"/>
+      </w:pPr>
+    </w:p>
+    <w:p>
+      <w:pPr>
+        <w:spacing w:after="0"/>
+      </w:pPr>
+      <w:r>
+        <w:rPr>
+          <w:noProof/>
+        </w:rPr>
+        <w:drawing>
+          <wp:inline distT="0" distB="0" distL="0" distR="0" wp14:anchorId="71E56DA5" wp14:editId="1B02EEA1">
+            <wp:extent cx="5849222" cy="3248891"/>
+            <wp:effectExtent l="0" t="0" r="0" b="8890"/>
+            <wp:docPr id="7" name="Picture 7"/>
+            <wp:cNvGraphicFramePr>
+              <a:graphicFrameLocks xmlns:a="http://schemas.openxmlformats.org/drawingml/2006/main" noChangeAspect="1"/>
+            </wp:cNvGraphicFramePr>
+            <a:graphic xmlns:a="http://schemas.openxmlformats.org/drawingml/2006/main">
+              <a:graphicData uri="http://schemas.openxmlformats.org/drawingml/2006/picture">
+                <pic:pic xmlns:pic="http://schemas.openxmlformats.org/drawingml/2006/picture">
+                  <pic:nvPicPr>
+                    <pic:cNvPr id="7" name="Picture 7"/>
+                    <pic:cNvPicPr/>
+                  </pic:nvPicPr>
+                  <pic:blipFill>
+                    <a:blip r:embed="rId11" cstate="print">
+                      <a:extLst>
+                        <a:ext uri="{28A0092B-C50C-407E-A947-70E740481C1C}">
+                          <a14:useLocalDpi xmlns:a14="http://schemas.microsoft.com/office/drawing/2010/main" val="0"/>
+                        </a:ext>
+                      </a:extLst>
+                    </a:blip>
+                    <a:stretch>
+                      <a:fillRect/>
+                    </a:stretch>
+                  </pic:blipFill>
+                  <pic:spPr>
+                    <a:xfrm>
+                      <a:off x="0" y="0"/>
+                      <a:ext cx="5854710" cy="3251939"/>
+                    </a:xfrm>
+                    <a:prstGeom prst="rect">
+                      <a:avLst/>
+                    </a:prstGeom>
+                  </pic:spPr>
+                </pic:pic>
+              </a:graphicData>
+            </a:graphic>
+          </wp:inline>
+        </w:drawing>
+      </w:r>
+    </w:p>
+    <w:p>
+      <w:pPr>
+        <w:spacing w:after="0"/>
+      </w:pPr>
+    </w:p>
+    <w:p>
+      <w:pPr>
+        <w:spacing w:after="0"/>
+      </w:pPr>
+    </w:p>
+    <w:p>
+      <w:pPr>
+        <w:spacing w:after="0"/>
+      </w:pPr>
+    </w:p>
+    <w:p>
+      <w:pPr>
+        <w:pStyle w:val="ListParagraph"/>
+        <w:numPr>
+          <w:ilvl w:val="0"/>
+          <w:numId w:val="1"/>
+        </w:numPr>
+        <w:spacing w:after="0"/>
+        <w:ind w:left="360" w:hanging="270"/>
+      </w:pPr>
+      <w:r>
+        <w:t>Expenses and Income Categorization graphs</w:t>
+      </w:r>
+    </w:p>
+    <w:p>
+      <w:pPr>
+        <w:spacing w:after="0"/>
+      </w:pPr>
+    </w:p>
+    <w:p>
+      <w:pPr>
+        <w:spacing w:after="0"/>
+      </w:pPr>
+      <w:r>
+        <w:rPr>
+          <w:noProof/>
+        </w:rPr>
+        <w:drawing>
+          <wp:inline distT="0" distB="0" distL="0" distR="0" wp14:anchorId="17690A4C" wp14:editId="17D30B01">
+            <wp:extent cx="5861552" cy="2036618"/>
+            <wp:effectExtent l="0" t="0" r="6350" b="1905"/>
+            <wp:docPr id="8" name="Picture 8"/>
+            <wp:cNvGraphicFramePr>
+              <a:graphicFrameLocks xmlns:a="http://schemas.openxmlformats.org/drawingml/2006/main" noChangeAspect="1"/>
+            </wp:cNvGraphicFramePr>
+            <a:graphic xmlns:a="http://schemas.openxmlformats.org/drawingml/2006/main">
+              <a:graphicData uri="http://schemas.openxmlformats.org/drawingml/2006/picture">
+                <pic:pic xmlns:pic="http://schemas.openxmlformats.org/drawingml/2006/picture">
+                  <pic:nvPicPr>
+                    <pic:cNvPr id="8" name="Picture 8"/>
+                    <pic:cNvPicPr/>
+                  </pic:nvPicPr>
+                  <pic:blipFill>
+                    <a:blip r:embed="rId12" cstate="print">
+                      <a:extLst>
+                        <a:ext uri="{28A0092B-C50C-407E-A947-70E740481C1C}">
+                          <a14:useLocalDpi xmlns:a14="http://schemas.microsoft.com/office/drawing/2010/main" val="0"/>
+                        </a:ext>
+                      </a:extLst>
+                    </a:blip>
+                    <a:stretch>
+                      <a:fillRect/>
+                    </a:stretch>
+                  </pic:blipFill>
+                  <pic:spPr>
+                    <a:xfrm>
+                      <a:off x="0" y="0"/>
+                      <a:ext cx="5881696" cy="2043617"/>
+                    </a:xfrm>
+                    <a:prstGeom prst="rect">
+                      <a:avLst/>
+                    </a:prstGeom>
+                  </pic:spPr>
+                </pic:pic>
+              </a:graphicData>
+            </a:graphic>
+          </wp:inline>
+        </w:drawing>
+      </w:r>
+    </w:p>
+    <w:p>
+      <w:pPr>
+        <w:spacing w:after="0"/>
+      </w:pPr>
+    </w:p>
+    <w:p>
+      <w:pPr>
+        <w:spacing w:after="0"/>
+      </w:pPr>
+    </w:p>
+    <w:p>
+      <w:pPr>
+        <w:spacing w:after="0"/>
+      </w:pPr>
+      <w:r>
         <w:t>• Categorization of transactions (food, rent, bills, etc.)</w:t>
       </w:r>
       <w:r>
@@ -1180,8 +1685,14 @@
         <w:pStyle w:val="Heading2"/>
       </w:pPr>
       <w:r>
+        <w:lastRenderedPageBreak/>
         <w:t>4. Non-Functional Requirements</w:t>
       </w:r>
+    </w:p>
+    <w:p>
+      <w:pPr>
+        <w:spacing w:after="0"/>
+      </w:pPr>
     </w:p>
     <w:p>
       <w:r>
@@ -1192,6 +1703,15 @@
         <w:t>• Secure authentication and storage</w:t>
       </w:r>
       <w:r>
+        <w:t xml:space="preserve"> </w:t>
+      </w:r>
+      <w:r>
+        <w:rPr>
+          <w:highlight w:val="yellow"/>
+        </w:rPr>
+        <w:t>(Future)</w:t>
+      </w:r>
+      <w:r>
         <w:br/>
         <w:t xml:space="preserve">• Performance: Load transactions within </w:t>
       </w:r>
@@ -1206,8 +1726,1355 @@
         <w:t>• Scalability for cloud integration</w:t>
       </w:r>
       <w:r>
+        <w:t xml:space="preserve"> </w:t>
+      </w:r>
+      <w:r>
+        <w:rPr>
+          <w:highlight w:val="yellow"/>
+        </w:rPr>
+        <w:t>(Future)</w:t>
+      </w:r>
+      <w:r>
         <w:br/>
         <w:t>• Accessibility-compliant design</w:t>
+      </w:r>
+    </w:p>
+    <w:p>
+      <w:pPr>
+        <w:spacing w:after="160" w:line="259" w:lineRule="auto"/>
+      </w:pPr>
+    </w:p>
+    <w:p>
+      <w:pPr>
+        <w:pStyle w:val="Heading2"/>
+      </w:pPr>
+      <w:r>
+        <w:t>5. Architecture &amp; Technologies</w:t>
+      </w:r>
+    </w:p>
+    <w:p>
+      <w:pPr>
+        <w:pStyle w:val="Heading3"/>
+      </w:pPr>
+      <w:r>
+        <w:t>Architecture Overview</w:t>
+      </w:r>
+    </w:p>
+    <w:p/>
+    <w:p>
+      <w:r>
+        <w:rPr>
+          <w:noProof/>
+        </w:rPr>
+        <w:drawing>
+          <wp:inline distT="0" distB="0" distL="0" distR="0" wp14:anchorId="2FFD5D2D" wp14:editId="26222A7E">
+            <wp:extent cx="5188086" cy="3810000"/>
+            <wp:effectExtent l="0" t="0" r="0" b="0"/>
+            <wp:docPr id="9" name="Picture 9"/>
+            <wp:cNvGraphicFramePr>
+              <a:graphicFrameLocks xmlns:a="http://schemas.openxmlformats.org/drawingml/2006/main" noChangeAspect="1"/>
+            </wp:cNvGraphicFramePr>
+            <a:graphic xmlns:a="http://schemas.openxmlformats.org/drawingml/2006/main">
+              <a:graphicData uri="http://schemas.openxmlformats.org/drawingml/2006/picture">
+                <pic:pic xmlns:pic="http://schemas.openxmlformats.org/drawingml/2006/picture">
+                  <pic:nvPicPr>
+                    <pic:cNvPr id="9" name="Picture 9"/>
+                    <pic:cNvPicPr/>
+                  </pic:nvPicPr>
+                  <pic:blipFill>
+                    <a:blip r:embed="rId13" cstate="print">
+                      <a:extLst>
+                        <a:ext uri="{28A0092B-C50C-407E-A947-70E740481C1C}">
+                          <a14:useLocalDpi xmlns:a14="http://schemas.microsoft.com/office/drawing/2010/main" val="0"/>
+                        </a:ext>
+                      </a:extLst>
+                    </a:blip>
+                    <a:stretch>
+                      <a:fillRect/>
+                    </a:stretch>
+                  </pic:blipFill>
+                  <pic:spPr>
+                    <a:xfrm>
+                      <a:off x="0" y="0"/>
+                      <a:ext cx="5244335" cy="3851308"/>
+                    </a:xfrm>
+                    <a:prstGeom prst="rect">
+                      <a:avLst/>
+                    </a:prstGeom>
+                  </pic:spPr>
+                </pic:pic>
+              </a:graphicData>
+            </a:graphic>
+          </wp:inline>
+        </w:drawing>
+      </w:r>
+    </w:p>
+    <w:p/>
+    <w:p>
+      <w:r>
+        <w:rPr>
+          <w:b/>
+          <w:bCs/>
+        </w:rPr>
+        <w:t>Savr</w:t>
+      </w:r>
+      <w:r>
+        <w:t xml:space="preserve"> is built following the principles of Clean Architecture, ensuring a clear separation of concerns across the layers. </w:t>
+      </w:r>
+      <w:r>
+        <w:t>It k</w:t>
+      </w:r>
+      <w:r>
+        <w:t>eep</w:t>
+      </w:r>
+      <w:r>
+        <w:t>s</w:t>
+      </w:r>
+      <w:r>
+        <w:t xml:space="preserve"> the core business or application logic use cases independent of frontend and external frameworks. </w:t>
+      </w:r>
+      <w:r>
+        <w:t xml:space="preserve">. </w:t>
+      </w:r>
+      <w:r>
+        <w:t>This architecture promotes maintainability, testability, and scalability by organizing the codebase into well-defined layers:</w:t>
+      </w:r>
+    </w:p>
+    <w:p>
+      <w:r>
+        <w:rPr>
+          <w:b/>
+          <w:bCs/>
+        </w:rPr>
+        <w:lastRenderedPageBreak/>
+        <w:t>Independent of UI:</w:t>
+      </w:r>
+      <w:r>
+        <w:t xml:space="preserve"> presentation layers </w:t>
+      </w:r>
+      <w:r>
+        <w:t xml:space="preserve">could change </w:t>
+      </w:r>
+      <w:r>
+        <w:t xml:space="preserve">easily without </w:t>
+      </w:r>
+      <w:r>
+        <w:t>altering</w:t>
+      </w:r>
+      <w:r>
+        <w:t xml:space="preserve"> the application layer and so on. UI can be from any front-end framework, or console UI, any web, and can be replaced without changing the other layers or rest of the system.</w:t>
+      </w:r>
+    </w:p>
+    <w:p>
+      <w:r>
+        <w:rPr>
+          <w:b/>
+          <w:bCs/>
+        </w:rPr>
+        <w:t>Database Independent:</w:t>
+      </w:r>
+      <w:r>
+        <w:t xml:space="preserve"> The architecture should be flexible enough to swap the database without affecting the application use cases and entities. </w:t>
+      </w:r>
+    </w:p>
+    <w:p>
+      <w:r>
+        <w:rPr>
+          <w:b/>
+          <w:bCs/>
+        </w:rPr>
+        <w:t>Independent of External agency/libraries/Drivers:</w:t>
+      </w:r>
+      <w:r>
+        <w:t xml:space="preserve"> The business rules should be independent of external parties or agencies.</w:t>
+      </w:r>
+    </w:p>
+    <w:p>
+      <w:r>
+        <w:rPr>
+          <w:b/>
+          <w:bCs/>
+        </w:rPr>
+        <w:t>Framework Independent:</w:t>
+      </w:r>
+      <w:r>
+        <w:t xml:space="preserve"> The core business or application rules should be independent upon the existence of frameworks, librarie</w:t>
+      </w:r>
+      <w:r>
+        <w:t>s.</w:t>
+      </w:r>
+      <w:r>
+        <w:t>s for the future.</w:t>
+      </w:r>
+    </w:p>
+    <w:p>
+      <w:r>
+        <w:rPr>
+          <w:b/>
+          <w:bCs/>
+        </w:rPr>
+        <w:t>Testable:</w:t>
+      </w:r>
+      <w:r>
+        <w:t xml:space="preserve"> The architecture compl</w:t>
+      </w:r>
+      <w:r>
+        <w:t>ies</w:t>
+      </w:r>
+      <w:r>
+        <w:t xml:space="preserve"> with the testing of the core application and business cases and rules without the UI, database, Web server, or any external component.</w:t>
+      </w:r>
+    </w:p>
+    <w:p/>
+    <w:p>
+      <w:pPr>
+        <w:pStyle w:val="Heading3"/>
+      </w:pPr>
+      <w:r>
+        <w:t>Solution Structure</w:t>
+      </w:r>
+    </w:p>
+    <w:p>
+      <w:r>
+        <w:t>Project solution architecture is properly adhearing with the Clean Architecture concepts.</w:t>
+      </w:r>
+    </w:p>
+    <w:p>
+      <w:r>
+        <w:drawing>
+          <wp:inline distT="0" distB="0" distL="0" distR="0" wp14:anchorId="1FC774A1" wp14:editId="41D2060D">
+            <wp:extent cx="3215919" cy="4442845"/>
+            <wp:effectExtent l="0" t="0" r="3810" b="0"/>
+            <wp:docPr id="1" name="Picture 1"/>
+            <wp:cNvGraphicFramePr>
+              <a:graphicFrameLocks xmlns:a="http://schemas.openxmlformats.org/drawingml/2006/main" noChangeAspect="1"/>
+            </wp:cNvGraphicFramePr>
+            <a:graphic xmlns:a="http://schemas.openxmlformats.org/drawingml/2006/main">
+              <a:graphicData uri="http://schemas.openxmlformats.org/drawingml/2006/picture">
+                <pic:pic xmlns:pic="http://schemas.openxmlformats.org/drawingml/2006/picture">
+                  <pic:nvPicPr>
+                    <pic:cNvPr id="1" name=""/>
+                    <pic:cNvPicPr/>
+                  </pic:nvPicPr>
+                  <pic:blipFill>
+                    <a:blip r:embed="rId14"/>
+                    <a:stretch>
+                      <a:fillRect/>
+                    </a:stretch>
+                  </pic:blipFill>
+                  <pic:spPr>
+                    <a:xfrm>
+                      <a:off x="0" y="0"/>
+                      <a:ext cx="3215919" cy="4442845"/>
+                    </a:xfrm>
+                    <a:prstGeom prst="rect">
+                      <a:avLst/>
+                    </a:prstGeom>
+                  </pic:spPr>
+                </pic:pic>
+              </a:graphicData>
+            </a:graphic>
+          </wp:inline>
+        </w:drawing>
+      </w:r>
+    </w:p>
+    <w:p>
+      <w:pPr>
+        <w:pStyle w:val="Heading3"/>
+      </w:pPr>
+      <w:r>
+        <w:lastRenderedPageBreak/>
+        <w:t>5.1 Tech Stack</w:t>
+      </w:r>
+    </w:p>
+    <w:p>
+      <w:r>
+        <w:t xml:space="preserve">• Frontend: </w:t>
+      </w:r>
+      <w:r>
+        <w:t>Blazor Server Pages with MudBlazer UI Components</w:t>
+      </w:r>
+      <w:r>
+        <w:br/>
+        <w:t xml:space="preserve">• Backend: .NET </w:t>
+      </w:r>
+      <w:r>
+        <w:t xml:space="preserve">Core </w:t>
+      </w:r>
+      <w:r>
+        <w:t xml:space="preserve">Web API </w:t>
+      </w:r>
+      <w:r>
+        <w:br/>
+        <w:t>• Database: SQLite (local)</w:t>
+      </w:r>
+      <w:r>
+        <w:t xml:space="preserve"> </w:t>
+      </w:r>
+      <w:r>
+        <w:br/>
+        <w:t xml:space="preserve">• Authentication: </w:t>
+      </w:r>
+      <w:r>
+        <w:t>TBD</w:t>
+      </w:r>
+      <w:r>
+        <w:br/>
+        <w:t xml:space="preserve">• Analytics: </w:t>
+      </w:r>
+      <w:r>
+        <w:t>TBD</w:t>
+      </w:r>
+    </w:p>
+    <w:p>
+      <w:pPr>
+        <w:pStyle w:val="Heading3"/>
+      </w:pPr>
+      <w:r>
+        <w:t>5.2 Architecture Diagram</w:t>
+      </w:r>
+    </w:p>
+    <w:p>
+      <w:r>
+        <w:t>(Insert Diagram – showing client, storage, backend, optional integrations)</w:t>
+      </w:r>
+    </w:p>
+    <w:p/>
+    <w:p>
+      <w:r>
+        <w:rPr>
+          <w:noProof/>
+        </w:rPr>
+        <mc:AlternateContent>
+          <mc:Choice Requires="wps">
+            <w:drawing>
+              <wp:anchor distT="0" distB="0" distL="114300" distR="114300" simplePos="0" relativeHeight="251670528" behindDoc="0" locked="0" layoutInCell="1" allowOverlap="1" wp14:anchorId="07D09C0E" wp14:editId="404A0DA5">
+                <wp:simplePos x="0" y="0"/>
+                <wp:positionH relativeFrom="column">
+                  <wp:posOffset>2064327</wp:posOffset>
+                </wp:positionH>
+                <wp:positionV relativeFrom="paragraph">
+                  <wp:posOffset>63500</wp:posOffset>
+                </wp:positionV>
+                <wp:extent cx="2971800" cy="3345873"/>
+                <wp:effectExtent l="0" t="0" r="19050" b="26035"/>
+                <wp:wrapNone/>
+                <wp:docPr id="17" name="Rectangle 17"/>
+                <wp:cNvGraphicFramePr/>
+                <a:graphic xmlns:a="http://schemas.openxmlformats.org/drawingml/2006/main">
+                  <a:graphicData uri="http://schemas.microsoft.com/office/word/2010/wordprocessingShape">
+                    <wps:wsp>
+                      <wps:cNvSpPr/>
+                      <wps:spPr>
+                        <a:xfrm>
+                          <a:off x="0" y="0"/>
+                          <a:ext cx="2971800" cy="3345873"/>
+                        </a:xfrm>
+                        <a:prstGeom prst="rect">
+                          <a:avLst/>
+                        </a:prstGeom>
+                        <a:noFill/>
+                      </wps:spPr>
+                      <wps:style>
+                        <a:lnRef idx="2">
+                          <a:schemeClr val="accent1">
+                            <a:shade val="50000"/>
+                          </a:schemeClr>
+                        </a:lnRef>
+                        <a:fillRef idx="1">
+                          <a:schemeClr val="accent1"/>
+                        </a:fillRef>
+                        <a:effectRef idx="0">
+                          <a:schemeClr val="accent1"/>
+                        </a:effectRef>
+                        <a:fontRef idx="minor">
+                          <a:schemeClr val="lt1"/>
+                        </a:fontRef>
+                      </wps:style>
+                      <wps:bodyPr rot="0" spcFirstLastPara="0" vertOverflow="overflow" horzOverflow="overflow" vert="horz" wrap="square" lIns="91440" tIns="45720" rIns="91440" bIns="45720" numCol="1" spcCol="0" rtlCol="0" fromWordArt="0" anchor="ctr" anchorCtr="0" forceAA="0" compatLnSpc="1">
+                        <a:prstTxWarp prst="textNoShape">
+                          <a:avLst/>
+                        </a:prstTxWarp>
+                        <a:noAutofit/>
+                      </wps:bodyPr>
+                    </wps:wsp>
+                  </a:graphicData>
+                </a:graphic>
+              </wp:anchor>
+            </w:drawing>
+          </mc:Choice>
+          <mc:Fallback>
+            <w:pict>
+              <v:rect w14:anchorId="3CC3A31B" id="Rectangle 17" o:spid="_x0000_s1026" style="position:absolute;margin-left:162.55pt;margin-top:5pt;width:234pt;height:263.45pt;z-index:251670528;visibility:visible;mso-wrap-style:square;mso-wrap-distance-left:9pt;mso-wrap-distance-top:0;mso-wrap-distance-right:9pt;mso-wrap-distance-bottom:0;mso-position-horizontal:absolute;mso-position-horizontal-relative:text;mso-position-vertical:absolute;mso-position-vertical-relative:text;v-text-anchor:middle" o:gfxdata="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" filled="f" strokecolor="#1f3763 [1604]" strokeweight="1pt"/>
+            </w:pict>
+          </mc:Fallback>
+        </mc:AlternateContent>
+      </w:r>
+    </w:p>
+    <w:p>
+      <w:r>
+        <w:rPr>
+          <w:noProof/>
+        </w:rPr>
+        <mc:AlternateContent>
+          <mc:Choice Requires="wps">
+            <w:drawing>
+              <wp:anchor distT="0" distB="0" distL="114300" distR="114300" simplePos="0" relativeHeight="251669504" behindDoc="0" locked="0" layoutInCell="1" allowOverlap="1" wp14:anchorId="7C6D3B43" wp14:editId="28B6C624">
+                <wp:simplePos x="0" y="0"/>
+                <wp:positionH relativeFrom="column">
+                  <wp:posOffset>4495800</wp:posOffset>
+                </wp:positionH>
+                <wp:positionV relativeFrom="paragraph">
+                  <wp:posOffset>260465</wp:posOffset>
+                </wp:positionV>
+                <wp:extent cx="394393" cy="2209800"/>
+                <wp:effectExtent l="0" t="0" r="24765" b="19050"/>
+                <wp:wrapNone/>
+                <wp:docPr id="16" name="Rectangle 16"/>
+                <wp:cNvGraphicFramePr/>
+                <a:graphic xmlns:a="http://schemas.openxmlformats.org/drawingml/2006/main">
+                  <a:graphicData uri="http://schemas.microsoft.com/office/word/2010/wordprocessingShape">
+                    <wps:wsp>
+                      <wps:cNvSpPr/>
+                      <wps:spPr>
+                        <a:xfrm>
+                          <a:off x="0" y="0"/>
+                          <a:ext cx="394393" cy="2209800"/>
+                        </a:xfrm>
+                        <a:prstGeom prst="rect">
+                          <a:avLst/>
+                        </a:prstGeom>
+                      </wps:spPr>
+                      <wps:style>
+                        <a:lnRef idx="2">
+                          <a:schemeClr val="accent1">
+                            <a:shade val="50000"/>
+                          </a:schemeClr>
+                        </a:lnRef>
+                        <a:fillRef idx="1">
+                          <a:schemeClr val="accent1"/>
+                        </a:fillRef>
+                        <a:effectRef idx="0">
+                          <a:schemeClr val="accent1"/>
+                        </a:effectRef>
+                        <a:fontRef idx="minor">
+                          <a:schemeClr val="lt1"/>
+                        </a:fontRef>
+                      </wps:style>
+                      <wps:txbx>
+                        <w:txbxContent>
+                          <w:p>
+                            <w:pPr>
+                              <w:jc w:val="center"/>
+                            </w:pPr>
+                            <w:r>
+                              <w:t>EF</w:t>
+                            </w:r>
+                          </w:p>
+                        </w:txbxContent>
+                      </wps:txbx>
+                      <wps:bodyPr rot="0" spcFirstLastPara="0" vertOverflow="overflow" horzOverflow="overflow" vert="horz" wrap="square" lIns="91440" tIns="45720" rIns="91440" bIns="45720" numCol="1" spcCol="0" rtlCol="0" fromWordArt="0" anchor="ctr" anchorCtr="0" forceAA="0" compatLnSpc="1">
+                        <a:prstTxWarp prst="textNoShape">
+                          <a:avLst/>
+                        </a:prstTxWarp>
+                        <a:noAutofit/>
+                      </wps:bodyPr>
+                    </wps:wsp>
+                  </a:graphicData>
+                </a:graphic>
+                <wp14:sizeRelH relativeFrom="margin">
+                  <wp14:pctWidth>0</wp14:pctWidth>
+                </wp14:sizeRelH>
+              </wp:anchor>
+            </w:drawing>
+          </mc:Choice>
+          <mc:Fallback>
+            <w:pict>
+              <v:rect w14:anchorId="7C6D3B43" id="Rectangle 16" o:spid="_x0000_s1026" style="position:absolute;margin-left:354pt;margin-top:20.5pt;width:31.05pt;height:174pt;z-index:251669504;visibility:visible;mso-wrap-style:square;mso-width-percent:0;mso-wrap-distance-left:9pt;mso-wrap-distance-top:0;mso-wrap-distance-right:9pt;mso-wrap-distance-bottom:0;mso-position-horizontal:absolute;mso-position-horizontal-relative:text;mso-position-vertical:absolute;mso-position-vertical-relative:text;mso-width-percent:0;mso-width-relative:margin;v-text-anchor:middle" o:gfxdata="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" fillcolor="#4472c4 [3204]" strokecolor="#1f3763 [1604]" strokeweight="1pt">
+                <v:textbox>
+                  <w:txbxContent>
+                    <w:p>
+                      <w:pPr>
+                        <w:jc w:val="center"/>
+                      </w:pPr>
+                      <w:r>
+                        <w:t>EF</w:t>
+                      </w:r>
+                    </w:p>
+                  </w:txbxContent>
+                </v:textbox>
+              </v:rect>
+            </w:pict>
+          </mc:Fallback>
+        </mc:AlternateContent>
+      </w:r>
+      <w:r>
+        <w:rPr>
+          <w:noProof/>
+        </w:rPr>
+        <mc:AlternateContent>
+          <mc:Choice Requires="wps">
+            <w:drawing>
+              <wp:anchor distT="0" distB="0" distL="114300" distR="114300" simplePos="0" relativeHeight="251663360" behindDoc="0" locked="0" layoutInCell="1" allowOverlap="1" wp14:anchorId="601B564E" wp14:editId="444EE33A">
+                <wp:simplePos x="0" y="0"/>
+                <wp:positionH relativeFrom="margin">
+                  <wp:posOffset>3164147</wp:posOffset>
+                </wp:positionH>
+                <wp:positionV relativeFrom="paragraph">
+                  <wp:posOffset>211455</wp:posOffset>
+                </wp:positionV>
+                <wp:extent cx="1163320" cy="636905"/>
+                <wp:effectExtent l="0" t="0" r="17780" b="10795"/>
+                <wp:wrapNone/>
+                <wp:docPr id="12" name="Rectangle 12"/>
+                <wp:cNvGraphicFramePr/>
+                <a:graphic xmlns:a="http://schemas.openxmlformats.org/drawingml/2006/main">
+                  <a:graphicData uri="http://schemas.microsoft.com/office/word/2010/wordprocessingShape">
+                    <wps:wsp>
+                      <wps:cNvSpPr/>
+                      <wps:spPr>
+                        <a:xfrm>
+                          <a:off x="0" y="0"/>
+                          <a:ext cx="1163320" cy="636905"/>
+                        </a:xfrm>
+                        <a:prstGeom prst="rect">
+                          <a:avLst/>
+                        </a:prstGeom>
+                      </wps:spPr>
+                      <wps:style>
+                        <a:lnRef idx="2">
+                          <a:schemeClr val="accent1">
+                            <a:shade val="50000"/>
+                          </a:schemeClr>
+                        </a:lnRef>
+                        <a:fillRef idx="1">
+                          <a:schemeClr val="accent1"/>
+                        </a:fillRef>
+                        <a:effectRef idx="0">
+                          <a:schemeClr val="accent1"/>
+                        </a:effectRef>
+                        <a:fontRef idx="minor">
+                          <a:schemeClr val="lt1"/>
+                        </a:fontRef>
+                      </wps:style>
+                      <wps:txbx>
+                        <w:txbxContent>
+                          <w:p>
+                            <w:pPr>
+                              <w:jc w:val="center"/>
+                            </w:pPr>
+                            <w:r>
+                              <w:t>Expense Module</w:t>
+                            </w:r>
+                          </w:p>
+                        </w:txbxContent>
+                      </wps:txbx>
+                      <wps:bodyPr rot="0" spcFirstLastPara="0" vertOverflow="overflow" horzOverflow="overflow" vert="horz" wrap="square" lIns="91440" tIns="45720" rIns="91440" bIns="45720" numCol="1" spcCol="0" rtlCol="0" fromWordArt="0" anchor="ctr" anchorCtr="0" forceAA="0" compatLnSpc="1">
+                        <a:prstTxWarp prst="textNoShape">
+                          <a:avLst/>
+                        </a:prstTxWarp>
+                        <a:noAutofit/>
+                      </wps:bodyPr>
+                    </wps:wsp>
+                  </a:graphicData>
+                </a:graphic>
+                <wp14:sizeRelH relativeFrom="margin">
+                  <wp14:pctWidth>0</wp14:pctWidth>
+                </wp14:sizeRelH>
+                <wp14:sizeRelV relativeFrom="margin">
+                  <wp14:pctHeight>0</wp14:pctHeight>
+                </wp14:sizeRelV>
+              </wp:anchor>
+            </w:drawing>
+          </mc:Choice>
+          <mc:Fallback>
+            <w:pict>
+              <v:rect w14:anchorId="601B564E" id="Rectangle 12" o:spid="_x0000_s1027" style="position:absolute;margin-left:249.15pt;margin-top:16.65pt;width:91.6pt;height:50.15pt;z-index:251663360;visibility:visible;mso-wrap-style:square;mso-width-percent:0;mso-height-percent:0;mso-wrap-distance-left:9pt;mso-wrap-distance-top:0;mso-wrap-distance-right:9pt;mso-wrap-distance-bottom:0;mso-position-horizontal:absolute;mso-position-horizontal-relative:margin;mso-position-vertical:absolute;mso-position-vertical-relative:text;mso-width-percent:0;mso-height-percent:0;mso-width-relative:margin;mso-height-relative:margin;v-text-anchor:middle" o:gfxdata="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" fillcolor="#4472c4 [3204]" strokecolor="#1f3763 [1604]" strokeweight="1pt">
+                <v:textbox>
+                  <w:txbxContent>
+                    <w:p>
+                      <w:pPr>
+                        <w:jc w:val="center"/>
+                      </w:pPr>
+                      <w:r>
+                        <w:t>Expense Module</w:t>
+                      </w:r>
+                    </w:p>
+                  </w:txbxContent>
+                </v:textbox>
+                <w10:wrap anchorx="margin"/>
+              </v:rect>
+            </w:pict>
+          </mc:Fallback>
+        </mc:AlternateContent>
+      </w:r>
+      <w:r>
+        <w:rPr>
+          <w:noProof/>
+        </w:rPr>
+        <mc:AlternateContent>
+          <mc:Choice Requires="wps">
+            <w:drawing>
+              <wp:anchor distT="0" distB="0" distL="114300" distR="114300" simplePos="0" relativeHeight="251661312" behindDoc="0" locked="0" layoutInCell="1" allowOverlap="1" wp14:anchorId="424FB0D0" wp14:editId="696B2D37">
+                <wp:simplePos x="0" y="0"/>
+                <wp:positionH relativeFrom="margin">
+                  <wp:posOffset>2320636</wp:posOffset>
+                </wp:positionH>
+                <wp:positionV relativeFrom="paragraph">
+                  <wp:posOffset>198120</wp:posOffset>
+                </wp:positionV>
+                <wp:extent cx="699135" cy="2265218"/>
+                <wp:effectExtent l="0" t="0" r="24765" b="20955"/>
+                <wp:wrapNone/>
+                <wp:docPr id="11" name="Rectangle 11"/>
+                <wp:cNvGraphicFramePr/>
+                <a:graphic xmlns:a="http://schemas.openxmlformats.org/drawingml/2006/main">
+                  <a:graphicData uri="http://schemas.microsoft.com/office/word/2010/wordprocessingShape">
+                    <wps:wsp>
+                      <wps:cNvSpPr/>
+                      <wps:spPr>
+                        <a:xfrm>
+                          <a:off x="0" y="0"/>
+                          <a:ext cx="699135" cy="2265218"/>
+                        </a:xfrm>
+                        <a:prstGeom prst="rect">
+                          <a:avLst/>
+                        </a:prstGeom>
+                      </wps:spPr>
+                      <wps:style>
+                        <a:lnRef idx="2">
+                          <a:schemeClr val="accent1">
+                            <a:shade val="50000"/>
+                          </a:schemeClr>
+                        </a:lnRef>
+                        <a:fillRef idx="1">
+                          <a:schemeClr val="accent1"/>
+                        </a:fillRef>
+                        <a:effectRef idx="0">
+                          <a:schemeClr val="accent1"/>
+                        </a:effectRef>
+                        <a:fontRef idx="minor">
+                          <a:schemeClr val="lt1"/>
+                        </a:fontRef>
+                      </wps:style>
+                      <wps:txbx>
+                        <w:txbxContent>
+                          <w:p>
+                            <w:pPr>
+                              <w:jc w:val="center"/>
+                            </w:pPr>
+                            <w:r>
+                              <w:t xml:space="preserve">Savr </w:t>
+                            </w:r>
+                            <w:r>
+                              <w:t>REST</w:t>
+                            </w:r>
+                            <w:r>
+                              <w:t xml:space="preserve"> API</w:t>
+                            </w:r>
+                          </w:p>
+                        </w:txbxContent>
+                      </wps:txbx>
+                      <wps:bodyPr rot="0" spcFirstLastPara="0" vertOverflow="overflow" horzOverflow="overflow" vert="horz" wrap="square" lIns="91440" tIns="45720" rIns="91440" bIns="45720" numCol="1" spcCol="0" rtlCol="0" fromWordArt="0" anchor="ctr" anchorCtr="0" forceAA="0" compatLnSpc="1">
+                        <a:prstTxWarp prst="textNoShape">
+                          <a:avLst/>
+                        </a:prstTxWarp>
+                        <a:noAutofit/>
+                      </wps:bodyPr>
+                    </wps:wsp>
+                  </a:graphicData>
+                </a:graphic>
+                <wp14:sizeRelH relativeFrom="margin">
+                  <wp14:pctWidth>0</wp14:pctWidth>
+                </wp14:sizeRelH>
+                <wp14:sizeRelV relativeFrom="margin">
+                  <wp14:pctHeight>0</wp14:pctHeight>
+                </wp14:sizeRelV>
+              </wp:anchor>
+            </w:drawing>
+          </mc:Choice>
+          <mc:Fallback>
+            <w:pict>
+              <v:rect w14:anchorId="424FB0D0" id="Rectangle 11" o:spid="_x0000_s1028" style="position:absolute;margin-left:182.75pt;margin-top:15.6pt;width:55.05pt;height:178.35pt;z-index:251661312;visibility:visible;mso-wrap-style:square;mso-width-percent:0;mso-height-percent:0;mso-wrap-distance-left:9pt;mso-wrap-distance-top:0;mso-wrap-distance-right:9pt;mso-wrap-distance-bottom:0;mso-position-horizontal:absolute;mso-position-horizontal-relative:margin;mso-position-vertical:absolute;mso-position-vertical-relative:text;mso-width-percent:0;mso-height-percent:0;mso-width-relative:margin;mso-height-relative:margin;v-text-anchor:middle" o:gfxdata="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" fillcolor="#4472c4 [3204]" strokecolor="#1f3763 [1604]" strokeweight="1pt">
+                <v:textbox>
+                  <w:txbxContent>
+                    <w:p>
+                      <w:pPr>
+                        <w:jc w:val="center"/>
+                      </w:pPr>
+                      <w:r>
+                        <w:t xml:space="preserve">Savr </w:t>
+                      </w:r>
+                      <w:r>
+                        <w:t>REST</w:t>
+                      </w:r>
+                      <w:r>
+                        <w:t xml:space="preserve"> API</w:t>
+                      </w:r>
+                    </w:p>
+                  </w:txbxContent>
+                </v:textbox>
+                <w10:wrap anchorx="margin"/>
+              </v:rect>
+            </w:pict>
+          </mc:Fallback>
+        </mc:AlternateContent>
+      </w:r>
+    </w:p>
+    <w:p>
+      <w:r>
+        <w:rPr>
+          <w:noProof/>
+        </w:rPr>
+        <mc:AlternateContent>
+          <mc:Choice Requires="wps">
+            <w:drawing>
+              <wp:anchor distT="0" distB="0" distL="114300" distR="114300" simplePos="0" relativeHeight="251659264" behindDoc="0" locked="0" layoutInCell="1" allowOverlap="1" wp14:anchorId="749B6B65" wp14:editId="4FB27850">
+                <wp:simplePos x="0" y="0"/>
+                <wp:positionH relativeFrom="column">
+                  <wp:posOffset>69273</wp:posOffset>
+                </wp:positionH>
+                <wp:positionV relativeFrom="paragraph">
+                  <wp:posOffset>165850</wp:posOffset>
+                </wp:positionV>
+                <wp:extent cx="1011382" cy="1364673"/>
+                <wp:effectExtent l="0" t="0" r="17780" b="26035"/>
+                <wp:wrapNone/>
+                <wp:docPr id="10" name="Rectangle 10"/>
+                <wp:cNvGraphicFramePr/>
+                <a:graphic xmlns:a="http://schemas.openxmlformats.org/drawingml/2006/main">
+                  <a:graphicData uri="http://schemas.microsoft.com/office/word/2010/wordprocessingShape">
+                    <wps:wsp>
+                      <wps:cNvSpPr/>
+                      <wps:spPr>
+                        <a:xfrm>
+                          <a:off x="0" y="0"/>
+                          <a:ext cx="1011382" cy="1364673"/>
+                        </a:xfrm>
+                        <a:prstGeom prst="rect">
+                          <a:avLst/>
+                        </a:prstGeom>
+                      </wps:spPr>
+                      <wps:style>
+                        <a:lnRef idx="2">
+                          <a:schemeClr val="accent1">
+                            <a:shade val="50000"/>
+                          </a:schemeClr>
+                        </a:lnRef>
+                        <a:fillRef idx="1">
+                          <a:schemeClr val="accent1"/>
+                        </a:fillRef>
+                        <a:effectRef idx="0">
+                          <a:schemeClr val="accent1"/>
+                        </a:effectRef>
+                        <a:fontRef idx="minor">
+                          <a:schemeClr val="lt1"/>
+                        </a:fontRef>
+                      </wps:style>
+                      <wps:txbx>
+                        <w:txbxContent>
+                          <w:p>
+                            <w:pPr>
+                              <w:jc w:val="center"/>
+                            </w:pPr>
+                            <w:r>
+                              <w:t>Savr -Web Client</w:t>
+                            </w:r>
+                          </w:p>
+                        </w:txbxContent>
+                      </wps:txbx>
+                      <wps:bodyPr rot="0" spcFirstLastPara="0" vertOverflow="overflow" horzOverflow="overflow" vert="horz" wrap="square" lIns="91440" tIns="45720" rIns="91440" bIns="45720" numCol="1" spcCol="0" rtlCol="0" fromWordArt="0" anchor="ctr" anchorCtr="0" forceAA="0" compatLnSpc="1">
+                        <a:prstTxWarp prst="textNoShape">
+                          <a:avLst/>
+                        </a:prstTxWarp>
+                        <a:noAutofit/>
+                      </wps:bodyPr>
+                    </wps:wsp>
+                  </a:graphicData>
+                </a:graphic>
+                <wp14:sizeRelH relativeFrom="margin">
+                  <wp14:pctWidth>0</wp14:pctWidth>
+                </wp14:sizeRelH>
+                <wp14:sizeRelV relativeFrom="margin">
+                  <wp14:pctHeight>0</wp14:pctHeight>
+                </wp14:sizeRelV>
+              </wp:anchor>
+            </w:drawing>
+          </mc:Choice>
+          <mc:Fallback>
+            <w:pict>
+              <v:rect w14:anchorId="749B6B65" id="Rectangle 10" o:spid="_x0000_s1029" style="position:absolute;margin-left:5.45pt;margin-top:13.05pt;width:79.65pt;height:107.45pt;z-index:251659264;visibility:visible;mso-wrap-style:square;mso-width-percent:0;mso-height-percent:0;mso-wrap-distance-left:9pt;mso-wrap-distance-top:0;mso-wrap-distance-right:9pt;mso-wrap-distance-bottom:0;mso-position-horizontal:absolute;mso-position-horizontal-relative:text;mso-position-vertical:absolute;mso-position-vertical-relative:text;mso-width-percent:0;mso-height-percent:0;mso-width-relative:margin;mso-height-relative:margin;v-text-anchor:middle" o:gfxdata="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" fillcolor="#4472c4 [3204]" strokecolor="#1f3763 [1604]" strokeweight="1pt">
+                <v:textbox>
+                  <w:txbxContent>
+                    <w:p>
+                      <w:pPr>
+                        <w:jc w:val="center"/>
+                      </w:pPr>
+                      <w:r>
+                        <w:t>Savr -Web Client</w:t>
+                      </w:r>
+                    </w:p>
+                  </w:txbxContent>
+                </v:textbox>
+              </v:rect>
+            </w:pict>
+          </mc:Fallback>
+        </mc:AlternateContent>
+      </w:r>
+    </w:p>
+    <w:p>
+      <w:r>
+        <w:rPr>
+          <w:noProof/>
+        </w:rPr>
+        <mc:AlternateContent>
+          <mc:Choice Requires="wps">
+            <w:drawing>
+              <wp:anchor distT="0" distB="0" distL="114300" distR="114300" simplePos="0" relativeHeight="251668480" behindDoc="0" locked="0" layoutInCell="1" allowOverlap="1" wp14:anchorId="49A1A212" wp14:editId="5D2C7D7D">
+                <wp:simplePos x="0" y="0"/>
+                <wp:positionH relativeFrom="rightMargin">
+                  <wp:align>left</wp:align>
+                </wp:positionH>
+                <wp:positionV relativeFrom="paragraph">
+                  <wp:posOffset>71063</wp:posOffset>
+                </wp:positionV>
+                <wp:extent cx="782781" cy="1177637"/>
+                <wp:effectExtent l="0" t="0" r="17780" b="22860"/>
+                <wp:wrapNone/>
+                <wp:docPr id="15" name="Cylinder 15"/>
+                <wp:cNvGraphicFramePr/>
+                <a:graphic xmlns:a="http://schemas.openxmlformats.org/drawingml/2006/main">
+                  <a:graphicData uri="http://schemas.microsoft.com/office/word/2010/wordprocessingShape">
+                    <wps:wsp>
+                      <wps:cNvSpPr/>
+                      <wps:spPr>
+                        <a:xfrm>
+                          <a:off x="0" y="0"/>
+                          <a:ext cx="782781" cy="1177637"/>
+                        </a:xfrm>
+                        <a:prstGeom prst="can">
+                          <a:avLst/>
+                        </a:prstGeom>
+                      </wps:spPr>
+                      <wps:style>
+                        <a:lnRef idx="2">
+                          <a:schemeClr val="accent1">
+                            <a:shade val="50000"/>
+                          </a:schemeClr>
+                        </a:lnRef>
+                        <a:fillRef idx="1">
+                          <a:schemeClr val="accent1"/>
+                        </a:fillRef>
+                        <a:effectRef idx="0">
+                          <a:schemeClr val="accent1"/>
+                        </a:effectRef>
+                        <a:fontRef idx="minor">
+                          <a:schemeClr val="lt1"/>
+                        </a:fontRef>
+                      </wps:style>
+                      <wps:txbx>
+                        <w:txbxContent>
+                          <w:p>
+                            <w:pPr>
+                              <w:jc w:val="center"/>
+                            </w:pPr>
+                            <w:r>
+                              <w:t>MS SQL Database</w:t>
+                            </w:r>
+                          </w:p>
+                        </w:txbxContent>
+                      </wps:txbx>
+                      <wps:bodyPr rot="0" spcFirstLastPara="0" vertOverflow="overflow" horzOverflow="overflow" vert="horz" wrap="square" lIns="91440" tIns="45720" rIns="91440" bIns="45720" numCol="1" spcCol="0" rtlCol="0" fromWordArt="0" anchor="ctr" anchorCtr="0" forceAA="0" compatLnSpc="1">
+                        <a:prstTxWarp prst="textNoShape">
+                          <a:avLst/>
+                        </a:prstTxWarp>
+                        <a:noAutofit/>
+                      </wps:bodyPr>
+                    </wps:wsp>
+                  </a:graphicData>
+                </a:graphic>
+              </wp:anchor>
+            </w:drawing>
+          </mc:Choice>
+          <mc:Fallback>
+            <w:pict>
+              <v:shapetype w14:anchorId="49A1A212" id="_x0000_t22" coordsize="21600,21600" o:spt="22" adj="5400" path="m10800,qx0@1l0@2qy10800,21600,21600@2l21600@1qy10800,xem0@1qy10800@0,21600@1nfe">
+                <v:formulas>
+                  <v:f eqn="val #0"/>
+                  <v:f eqn="prod #0 1 2"/>
+                  <v:f eqn="sum height 0 @1"/>
+                </v:formulas>
+                <v:path o:extrusionok="f" gradientshapeok="t" o:connecttype="custom" o:connectlocs="10800,@0;10800,0;0,10800;10800,21600;21600,10800" o:connectangles="270,270,180,90,0" textboxrect="0,@0,21600,@2"/>
+                <v:handles>
+                  <v:h position="center,#0" yrange="0,10800"/>
+                </v:handles>
+                <o:complex v:ext="view"/>
+              </v:shapetype>
+              <v:shape id="Cylinder 15" o:spid="_x0000_s1030" type="#_x0000_t22" style="position:absolute;margin-left:0;margin-top:5.6pt;width:61.65pt;height:92.75pt;z-index:251668480;visibility:visible;mso-wrap-style:square;mso-wrap-distance-left:9pt;mso-wrap-distance-top:0;mso-wrap-distance-right:9pt;mso-wrap-distance-bottom:0;mso-position-horizontal:left;mso-position-horizontal-relative:right-margin-area;mso-position-vertical:absolute;mso-position-vertical-relative:text;v-text-anchor:middle" o:gfxdata="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" adj="3589" fillcolor="#4472c4 [3204]" strokecolor="#1f3763 [1604]" strokeweight="1pt">
+                <v:stroke joinstyle="miter"/>
+                <v:textbox>
+                  <w:txbxContent>
+                    <w:p>
+                      <w:pPr>
+                        <w:jc w:val="center"/>
+                      </w:pPr>
+                      <w:r>
+                        <w:t>MS SQL Database</w:t>
+                      </w:r>
+                    </w:p>
+                  </w:txbxContent>
+                </v:textbox>
+                <w10:wrap anchorx="margin"/>
+              </v:shape>
+            </w:pict>
+          </mc:Fallback>
+        </mc:AlternateContent>
+      </w:r>
+    </w:p>
+    <w:p>
+      <w:r>
+        <w:rPr>
+          <w:noProof/>
+        </w:rPr>
+        <mc:AlternateContent>
+          <mc:Choice Requires="wps">
+            <w:drawing>
+              <wp:anchor distT="0" distB="0" distL="114300" distR="114300" simplePos="0" relativeHeight="251673600" behindDoc="0" locked="0" layoutInCell="1" allowOverlap="1" wp14:anchorId="42825CD7" wp14:editId="23F1BF82">
+                <wp:simplePos x="0" y="0"/>
+                <wp:positionH relativeFrom="margin">
+                  <wp:align>right</wp:align>
+                </wp:positionH>
+                <wp:positionV relativeFrom="paragraph">
+                  <wp:posOffset>147378</wp:posOffset>
+                </wp:positionV>
+                <wp:extent cx="491317" cy="45719"/>
+                <wp:effectExtent l="0" t="57150" r="61595" b="88265"/>
+                <wp:wrapNone/>
+                <wp:docPr id="19" name="Straight Arrow Connector 19"/>
+                <wp:cNvGraphicFramePr/>
+                <a:graphic xmlns:a="http://schemas.openxmlformats.org/drawingml/2006/main">
+                  <a:graphicData uri="http://schemas.microsoft.com/office/word/2010/wordprocessingShape">
+                    <wps:wsp>
+                      <wps:cNvCnPr/>
+                      <wps:spPr>
+                        <a:xfrm>
+                          <a:off x="0" y="0"/>
+                          <a:ext cx="491317" cy="45719"/>
+                        </a:xfrm>
+                        <a:prstGeom prst="straightConnector1">
+                          <a:avLst/>
+                        </a:prstGeom>
+                        <a:ln>
+                          <a:headEnd type="triangle"/>
+                          <a:tailEnd type="triangle"/>
+                        </a:ln>
+                      </wps:spPr>
+                      <wps:style>
+                        <a:lnRef idx="1">
+                          <a:schemeClr val="accent1"/>
+                        </a:lnRef>
+                        <a:fillRef idx="0">
+                          <a:schemeClr val="accent1"/>
+                        </a:fillRef>
+                        <a:effectRef idx="0">
+                          <a:schemeClr val="accent1"/>
+                        </a:effectRef>
+                        <a:fontRef idx="minor">
+                          <a:schemeClr val="tx1"/>
+                        </a:fontRef>
+                      </wps:style>
+                      <wps:bodyPr/>
+                    </wps:wsp>
+                  </a:graphicData>
+                </a:graphic>
+                <wp14:sizeRelH relativeFrom="margin">
+                  <wp14:pctWidth>0</wp14:pctWidth>
+                </wp14:sizeRelH>
+                <wp14:sizeRelV relativeFrom="margin">
+                  <wp14:pctHeight>0</wp14:pctHeight>
+                </wp14:sizeRelV>
+              </wp:anchor>
+            </w:drawing>
+          </mc:Choice>
+          <mc:Fallback>
+            <w:pict>
+              <v:shapetype w14:anchorId="33AD29AE" id="_x0000_t32" coordsize="21600,21600" o:spt="32" o:oned="t" path="m,l21600,21600e" filled="f">
+                <v:path arrowok="t" fillok="f" o:connecttype="none"/>
+                <o:lock v:ext="edit" shapetype="t"/>
+              </v:shapetype>
+              <v:shape id="Straight Arrow Connector 19" o:spid="_x0000_s1026" type="#_x0000_t32" style="position:absolute;margin-left:-12.5pt;margin-top:11.6pt;width:38.7pt;height:3.6pt;z-index:251673600;visibility:visible;mso-wrap-style:square;mso-width-percent:0;mso-height-percent:0;mso-wrap-distance-left:9pt;mso-wrap-distance-top:0;mso-wrap-distance-right:9pt;mso-wrap-distance-bottom:0;mso-position-horizontal:right;mso-position-horizontal-relative:margin;mso-position-vertical:absolute;mso-position-vertical-relative:text;mso-width-percent:0;mso-height-percent:0;mso-width-relative:margin;mso-height-relative:margin" o:gfxdata="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" strokecolor="#4472c4 [3204]" strokeweight=".5pt">
+                <v:stroke startarrow="block" endarrow="block" joinstyle="miter"/>
+                <w10:wrap anchorx="margin"/>
+              </v:shape>
+            </w:pict>
+          </mc:Fallback>
+        </mc:AlternateContent>
+      </w:r>
+      <w:r>
+        <w:rPr>
+          <w:noProof/>
+        </w:rPr>
+        <mc:AlternateContent>
+          <mc:Choice Requires="wps">
+            <w:drawing>
+              <wp:anchor distT="0" distB="0" distL="114300" distR="114300" simplePos="0" relativeHeight="251671552" behindDoc="0" locked="0" layoutInCell="1" allowOverlap="1" wp14:anchorId="7A8BD26A" wp14:editId="106AF09D">
+                <wp:simplePos x="0" y="0"/>
+                <wp:positionH relativeFrom="column">
+                  <wp:posOffset>1115291</wp:posOffset>
+                </wp:positionH>
+                <wp:positionV relativeFrom="paragraph">
+                  <wp:posOffset>163657</wp:posOffset>
+                </wp:positionV>
+                <wp:extent cx="1156854" cy="0"/>
+                <wp:effectExtent l="38100" t="76200" r="24765" b="95250"/>
+                <wp:wrapNone/>
+                <wp:docPr id="18" name="Straight Arrow Connector 18"/>
+                <wp:cNvGraphicFramePr/>
+                <a:graphic xmlns:a="http://schemas.openxmlformats.org/drawingml/2006/main">
+                  <a:graphicData uri="http://schemas.microsoft.com/office/word/2010/wordprocessingShape">
+                    <wps:wsp>
+                      <wps:cNvCnPr/>
+                      <wps:spPr>
+                        <a:xfrm>
+                          <a:off x="0" y="0"/>
+                          <a:ext cx="1156854" cy="0"/>
+                        </a:xfrm>
+                        <a:prstGeom prst="straightConnector1">
+                          <a:avLst/>
+                        </a:prstGeom>
+                        <a:ln>
+                          <a:headEnd type="triangle"/>
+                          <a:tailEnd type="triangle"/>
+                        </a:ln>
+                      </wps:spPr>
+                      <wps:style>
+                        <a:lnRef idx="1">
+                          <a:schemeClr val="accent1"/>
+                        </a:lnRef>
+                        <a:fillRef idx="0">
+                          <a:schemeClr val="accent1"/>
+                        </a:fillRef>
+                        <a:effectRef idx="0">
+                          <a:schemeClr val="accent1"/>
+                        </a:effectRef>
+                        <a:fontRef idx="minor">
+                          <a:schemeClr val="tx1"/>
+                        </a:fontRef>
+                      </wps:style>
+                      <wps:bodyPr/>
+                    </wps:wsp>
+                  </a:graphicData>
+                </a:graphic>
+              </wp:anchor>
+            </w:drawing>
+          </mc:Choice>
+          <mc:Fallback>
+            <w:pict>
+              <v:shape w14:anchorId="0D80A16B" id="Straight Arrow Connector 18" o:spid="_x0000_s1026" type="#_x0000_t32" style="position:absolute;margin-left:87.8pt;margin-top:12.9pt;width:91.1pt;height:0;z-index:251671552;visibility:visible;mso-wrap-style:square;mso-wrap-distance-left:9pt;mso-wrap-distance-top:0;mso-wrap-distance-right:9pt;mso-wrap-distance-bottom:0;mso-position-horizontal:absolute;mso-position-horizontal-relative:text;mso-position-vertical:absolute;mso-position-vertical-relative:text" o:gfxdata="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" strokecolor="#4472c4 [3204]" strokeweight=".5pt">
+                <v:stroke startarrow="block" endarrow="block" joinstyle="miter"/>
+              </v:shape>
+            </w:pict>
+          </mc:Fallback>
+        </mc:AlternateContent>
+      </w:r>
+      <w:r>
+        <w:rPr>
+          <w:noProof/>
+        </w:rPr>
+        <mc:AlternateContent>
+          <mc:Choice Requires="wps">
+            <w:drawing>
+              <wp:anchor distT="0" distB="0" distL="114300" distR="114300" simplePos="0" relativeHeight="251665408" behindDoc="0" locked="0" layoutInCell="1" allowOverlap="1" wp14:anchorId="34633E42" wp14:editId="7B4A833C">
+                <wp:simplePos x="0" y="0"/>
+                <wp:positionH relativeFrom="margin">
+                  <wp:posOffset>3157162</wp:posOffset>
+                </wp:positionH>
+                <wp:positionV relativeFrom="paragraph">
+                  <wp:posOffset>38100</wp:posOffset>
+                </wp:positionV>
+                <wp:extent cx="1163782" cy="637309"/>
+                <wp:effectExtent l="0" t="0" r="17780" b="10795"/>
+                <wp:wrapNone/>
+                <wp:docPr id="13" name="Rectangle 13"/>
+                <wp:cNvGraphicFramePr/>
+                <a:graphic xmlns:a="http://schemas.openxmlformats.org/drawingml/2006/main">
+                  <a:graphicData uri="http://schemas.microsoft.com/office/word/2010/wordprocessingShape">
+                    <wps:wsp>
+                      <wps:cNvSpPr/>
+                      <wps:spPr>
+                        <a:xfrm>
+                          <a:off x="0" y="0"/>
+                          <a:ext cx="1163782" cy="637309"/>
+                        </a:xfrm>
+                        <a:prstGeom prst="rect">
+                          <a:avLst/>
+                        </a:prstGeom>
+                      </wps:spPr>
+                      <wps:style>
+                        <a:lnRef idx="2">
+                          <a:schemeClr val="accent1">
+                            <a:shade val="50000"/>
+                          </a:schemeClr>
+                        </a:lnRef>
+                        <a:fillRef idx="1">
+                          <a:schemeClr val="accent1"/>
+                        </a:fillRef>
+                        <a:effectRef idx="0">
+                          <a:schemeClr val="accent1"/>
+                        </a:effectRef>
+                        <a:fontRef idx="minor">
+                          <a:schemeClr val="lt1"/>
+                        </a:fontRef>
+                      </wps:style>
+                      <wps:txbx>
+                        <w:txbxContent>
+                          <w:p>
+                            <w:pPr>
+                              <w:jc w:val="center"/>
+                            </w:pPr>
+                            <w:r>
+                              <w:t>Income</w:t>
+                            </w:r>
+                            <w:r>
+                              <w:t xml:space="preserve"> Module</w:t>
+                            </w:r>
+                          </w:p>
+                        </w:txbxContent>
+                      </wps:txbx>
+                      <wps:bodyPr rot="0" spcFirstLastPara="0" vertOverflow="overflow" horzOverflow="overflow" vert="horz" wrap="square" lIns="91440" tIns="45720" rIns="91440" bIns="45720" numCol="1" spcCol="0" rtlCol="0" fromWordArt="0" anchor="ctr" anchorCtr="0" forceAA="0" compatLnSpc="1">
+                        <a:prstTxWarp prst="textNoShape">
+                          <a:avLst/>
+                        </a:prstTxWarp>
+                        <a:noAutofit/>
+                      </wps:bodyPr>
+                    </wps:wsp>
+                  </a:graphicData>
+                </a:graphic>
+                <wp14:sizeRelH relativeFrom="margin">
+                  <wp14:pctWidth>0</wp14:pctWidth>
+                </wp14:sizeRelH>
+                <wp14:sizeRelV relativeFrom="margin">
+                  <wp14:pctHeight>0</wp14:pctHeight>
+                </wp14:sizeRelV>
+              </wp:anchor>
+            </w:drawing>
+          </mc:Choice>
+          <mc:Fallback>
+            <w:pict>
+              <v:rect w14:anchorId="34633E42" id="Rectangle 13" o:spid="_x0000_s1031" style="position:absolute;margin-left:248.6pt;margin-top:3pt;width:91.65pt;height:50.2pt;z-index:251665408;visibility:visible;mso-wrap-style:square;mso-width-percent:0;mso-height-percent:0;mso-wrap-distance-left:9pt;mso-wrap-distance-top:0;mso-wrap-distance-right:9pt;mso-wrap-distance-bottom:0;mso-position-horizontal:absolute;mso-position-horizontal-relative:margin;mso-position-vertical:absolute;mso-position-vertical-relative:text;mso-width-percent:0;mso-height-percent:0;mso-width-relative:margin;mso-height-relative:margin;v-text-anchor:middle" o:gfxdata="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" fillcolor="#4472c4 [3204]" strokecolor="#1f3763 [1604]" strokeweight="1pt">
+                <v:textbox>
+                  <w:txbxContent>
+                    <w:p>
+                      <w:pPr>
+                        <w:jc w:val="center"/>
+                      </w:pPr>
+                      <w:r>
+                        <w:t>Income</w:t>
+                      </w:r>
+                      <w:r>
+                        <w:t xml:space="preserve"> Module</w:t>
+                      </w:r>
+                    </w:p>
+                  </w:txbxContent>
+                </v:textbox>
+                <w10:wrap anchorx="margin"/>
+              </v:rect>
+            </w:pict>
+          </mc:Fallback>
+        </mc:AlternateContent>
+      </w:r>
+      <w:r>
+        <w:rPr>
+          <w:noProof/>
+        </w:rPr>
+        <w:t xml:space="preserve"> </w:t>
+      </w:r>
+    </w:p>
+    <w:p/>
+    <w:p>
+      <w:r>
+        <w:rPr>
+          <w:noProof/>
+        </w:rPr>
+        <mc:AlternateContent>
+          <mc:Choice Requires="wps">
+            <w:drawing>
+              <wp:anchor distT="0" distB="0" distL="114300" distR="114300" simplePos="0" relativeHeight="251667456" behindDoc="0" locked="0" layoutInCell="1" allowOverlap="1" wp14:anchorId="7F598B63" wp14:editId="467B090B">
+                <wp:simplePos x="0" y="0"/>
+                <wp:positionH relativeFrom="margin">
+                  <wp:posOffset>3171132</wp:posOffset>
+                </wp:positionH>
+                <wp:positionV relativeFrom="paragraph">
+                  <wp:posOffset>197485</wp:posOffset>
+                </wp:positionV>
+                <wp:extent cx="1163782" cy="637309"/>
+                <wp:effectExtent l="0" t="0" r="17780" b="10795"/>
+                <wp:wrapNone/>
+                <wp:docPr id="14" name="Rectangle 14"/>
+                <wp:cNvGraphicFramePr/>
+                <a:graphic xmlns:a="http://schemas.openxmlformats.org/drawingml/2006/main">
+                  <a:graphicData uri="http://schemas.microsoft.com/office/word/2010/wordprocessingShape">
+                    <wps:wsp>
+                      <wps:cNvSpPr/>
+                      <wps:spPr>
+                        <a:xfrm>
+                          <a:off x="0" y="0"/>
+                          <a:ext cx="1163782" cy="637309"/>
+                        </a:xfrm>
+                        <a:prstGeom prst="rect">
+                          <a:avLst/>
+                        </a:prstGeom>
+                      </wps:spPr>
+                      <wps:style>
+                        <a:lnRef idx="2">
+                          <a:schemeClr val="accent1">
+                            <a:shade val="50000"/>
+                          </a:schemeClr>
+                        </a:lnRef>
+                        <a:fillRef idx="1">
+                          <a:schemeClr val="accent1"/>
+                        </a:fillRef>
+                        <a:effectRef idx="0">
+                          <a:schemeClr val="accent1"/>
+                        </a:effectRef>
+                        <a:fontRef idx="minor">
+                          <a:schemeClr val="lt1"/>
+                        </a:fontRef>
+                      </wps:style>
+                      <wps:txbx>
+                        <w:txbxContent>
+                          <w:p>
+                            <w:pPr>
+                              <w:jc w:val="center"/>
+                            </w:pPr>
+                            <w:r>
+                              <w:t>Dashboard</w:t>
+                            </w:r>
+                            <w:r>
+                              <w:t xml:space="preserve"> Module</w:t>
+                            </w:r>
+                          </w:p>
+                        </w:txbxContent>
+                      </wps:txbx>
+                      <wps:bodyPr rot="0" spcFirstLastPara="0" vertOverflow="overflow" horzOverflow="overflow" vert="horz" wrap="square" lIns="91440" tIns="45720" rIns="91440" bIns="45720" numCol="1" spcCol="0" rtlCol="0" fromWordArt="0" anchor="ctr" anchorCtr="0" forceAA="0" compatLnSpc="1">
+                        <a:prstTxWarp prst="textNoShape">
+                          <a:avLst/>
+                        </a:prstTxWarp>
+                        <a:noAutofit/>
+                      </wps:bodyPr>
+                    </wps:wsp>
+                  </a:graphicData>
+                </a:graphic>
+                <wp14:sizeRelH relativeFrom="margin">
+                  <wp14:pctWidth>0</wp14:pctWidth>
+                </wp14:sizeRelH>
+                <wp14:sizeRelV relativeFrom="margin">
+                  <wp14:pctHeight>0</wp14:pctHeight>
+                </wp14:sizeRelV>
+              </wp:anchor>
+            </w:drawing>
+          </mc:Choice>
+          <mc:Fallback>
+            <w:pict>
+              <v:rect w14:anchorId="7F598B63" id="Rectangle 14" o:spid="_x0000_s1032" style="position:absolute;margin-left:249.7pt;margin-top:15.55pt;width:91.65pt;height:50.2pt;z-index:251667456;visibility:visible;mso-wrap-style:square;mso-width-percent:0;mso-height-percent:0;mso-wrap-distance-left:9pt;mso-wrap-distance-top:0;mso-wrap-distance-right:9pt;mso-wrap-distance-bottom:0;mso-position-horizontal:absolute;mso-position-horizontal-relative:margin;mso-position-vertical:absolute;mso-position-vertical-relative:text;mso-width-percent:0;mso-height-percent:0;mso-width-relative:margin;mso-height-relative:margin;v-text-anchor:middle" o:gfxdata="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" fillcolor="#4472c4 [3204]" strokecolor="#1f3763 [1604]" strokeweight="1pt">
+                <v:textbox>
+                  <w:txbxContent>
+                    <w:p>
+                      <w:pPr>
+                        <w:jc w:val="center"/>
+                      </w:pPr>
+                      <w:r>
+                        <w:t>Dashboard</w:t>
+                      </w:r>
+                      <w:r>
+                        <w:t xml:space="preserve"> Module</w:t>
+                      </w:r>
+                    </w:p>
+                  </w:txbxContent>
+                </v:textbox>
+                <w10:wrap anchorx="margin"/>
+              </v:rect>
+            </w:pict>
+          </mc:Fallback>
+        </mc:AlternateContent>
+      </w:r>
+    </w:p>
+    <w:p/>
+    <w:p/>
+    <w:p/>
+    <w:p/>
+    <w:p/>
+    <w:p/>
+    <w:p/>
+    <w:p>
+      <w:pPr>
+        <w:pStyle w:val="Heading2"/>
+      </w:pPr>
+      <w:r>
+        <w:t>6. Data Design</w:t>
+      </w:r>
+    </w:p>
+    <w:p>
+      <w:pPr>
+        <w:pStyle w:val="Heading3"/>
+      </w:pPr>
+      <w:r>
+        <w:t>6.1 Key Entities</w:t>
+      </w:r>
+    </w:p>
+    <w:p>
+      <w:pPr>
+        <w:spacing w:after="0"/>
+      </w:pPr>
+      <w:r>
+        <w:t>• User: ID, Email, Password, Preferences</w:t>
+      </w:r>
+      <w:r>
+        <w:br/>
+        <w:t xml:space="preserve">• </w:t>
+      </w:r>
+      <w:r>
+        <w:t>Income</w:t>
+      </w:r>
+      <w:r>
+        <w:t xml:space="preserve">: ID, </w:t>
+      </w:r>
+      <w:r>
+        <w:t xml:space="preserve">Name, </w:t>
+      </w:r>
+      <w:r>
+        <w:t>Date, Category, Amount, Notes</w:t>
+      </w:r>
+    </w:p>
+    <w:p>
+      <w:pPr>
+        <w:pStyle w:val="ListParagraph"/>
+        <w:ind w:left="0"/>
+      </w:pPr>
+      <w:r>
+        <w:t>•</w:t>
+      </w:r>
+      <w:r>
+        <w:t xml:space="preserve"> </w:t>
+      </w:r>
+      <w:r>
+        <w:t>Expense</w:t>
+      </w:r>
+      <w:r>
+        <w:t xml:space="preserve">: ID, Date, </w:t>
+      </w:r>
+      <w:r>
+        <w:t>Type</w:t>
+      </w:r>
+      <w:r>
+        <w:t xml:space="preserve">, Amount, </w:t>
+      </w:r>
+      <w:r>
+        <w:t>Reference, Date</w:t>
+      </w:r>
+      <w:r>
+        <w:br/>
+        <w:t>• Goal: ID, Name, Target Amount, Saved Amount, Deadline</w:t>
       </w:r>
     </w:p>
     <w:p>
@@ -1225,125 +3092,6 @@
       <w:r>
         <w:br w:type="page"/>
       </w:r>
-    </w:p>
-    <w:p>
-      <w:pPr>
-        <w:pStyle w:val="Heading2"/>
-      </w:pPr>
-      <w:r>
-        <w:lastRenderedPageBreak/>
-        <w:t>5. Architecture &amp; Technologies</w:t>
-      </w:r>
-    </w:p>
-    <w:p>
-      <w:pPr>
-        <w:pStyle w:val="Heading3"/>
-      </w:pPr>
-      <w:r>
-        <w:t>5.1 Tech Stack</w:t>
-      </w:r>
-    </w:p>
-    <w:p>
-      <w:r>
-        <w:t xml:space="preserve">• Frontend: </w:t>
-      </w:r>
-      <w:r>
-        <w:t>Blazor</w:t>
-      </w:r>
-      <w:r>
-        <w:br/>
-        <w:t xml:space="preserve">• Backend: .NET </w:t>
-      </w:r>
-      <w:r>
-        <w:t xml:space="preserve">Core </w:t>
-      </w:r>
-      <w:r>
-        <w:t xml:space="preserve">Web API </w:t>
-      </w:r>
-      <w:r>
-        <w:br/>
-        <w:t>• Database: SQLite (local)</w:t>
-      </w:r>
-      <w:r>
-        <w:t xml:space="preserve"> </w:t>
-      </w:r>
-      <w:r>
-        <w:br/>
-        <w:t xml:space="preserve">• Authentication: </w:t>
-      </w:r>
-      <w:r>
-        <w:t>TBD</w:t>
-      </w:r>
-      <w:r>
-        <w:br/>
-        <w:t xml:space="preserve">• Analytics: </w:t>
-      </w:r>
-      <w:r>
-        <w:t>TBD</w:t>
-      </w:r>
-    </w:p>
-    <w:p>
-      <w:pPr>
-        <w:pStyle w:val="Heading3"/>
-      </w:pPr>
-      <w:r>
-        <w:t>5.2 Architecture Diagram</w:t>
-      </w:r>
-    </w:p>
-    <w:p>
-      <w:r>
-        <w:t>(Insert Diagram – showing client, storage, backend, optional integrations)</w:t>
-      </w:r>
-    </w:p>
-    <w:p>
-      <w:pPr>
-        <w:pStyle w:val="Heading2"/>
-      </w:pPr>
-      <w:r>
-        <w:t>6. Data Design</w:t>
-      </w:r>
-    </w:p>
-    <w:p>
-      <w:pPr>
-        <w:pStyle w:val="Heading3"/>
-      </w:pPr>
-      <w:r>
-        <w:t>6.1 Key Entities</w:t>
-      </w:r>
-    </w:p>
-    <w:p>
-      <w:r>
-        <w:t>• User: ID, Email, Password, Preferences</w:t>
-      </w:r>
-      <w:r>
-        <w:br/>
-        <w:t>• Transaction: ID, Date, Type (Income/Expense), Category, Amount, Notes</w:t>
-      </w:r>
-      <w:r>
-        <w:br/>
-        <w:t>• Goal: ID, Name, Target Amount, Saved Amount, Deadline</w:t>
-      </w:r>
-    </w:p>
-    <w:p>
-      <w:pPr>
-        <w:spacing w:after="160" w:line="259" w:lineRule="auto"/>
-        <w:rPr>
-          <w:rFonts w:asciiTheme="majorHAnsi" w:eastAsiaTheme="majorEastAsia" w:hAnsiTheme="majorHAnsi" w:cstheme="majorBidi"/>
-          <w:b/>
-          <w:bCs/>
-          <w:color w:val="4472C4" w:themeColor="accent1"/>
-          <w:sz w:val="26"/>
-          <w:szCs w:val="26"/>
-        </w:rPr>
-      </w:pPr>
-      <w:r>
-        <w:br w:type="page"/>
-      </w:r>
-    </w:p>
-    <w:p>
-      <w:pPr>
-        <w:pStyle w:val="Heading2"/>
-      </w:pPr>
       <w:r>
         <w:lastRenderedPageBreak/>
         <w:t>7. UI/UX Design</w:t>
@@ -1358,6 +3106,9 @@
       </w:r>
     </w:p>
     <w:p>
+      <w:pPr>
+        <w:spacing w:after="0"/>
+      </w:pPr>
       <w:r>
         <w:t xml:space="preserve">• Clean, calm, and </w:t>
       </w:r>
@@ -1378,6 +3129,19 @@
     </w:p>
     <w:p>
       <w:pPr>
+        <w:pStyle w:val="ListParagraph"/>
+        <w:numPr>
+          <w:ilvl w:val="0"/>
+          <w:numId w:val="1"/>
+        </w:numPr>
+        <w:ind w:left="180" w:hanging="180"/>
+      </w:pPr>
+      <w:r>
+        <w:t>Responsive UI elements</w:t>
+      </w:r>
+    </w:p>
+    <w:p>
+      <w:pPr>
         <w:pStyle w:val="Heading3"/>
       </w:pPr>
       <w:r>
@@ -1407,13 +3171,7 @@
         <w:spacing w:after="0"/>
       </w:pPr>
       <w:r>
-        <w:t xml:space="preserve">• </w:t>
-      </w:r>
-      <w:r>
-        <w:t>Edit, Remove</w:t>
-      </w:r>
-      <w:r>
-        <w:t xml:space="preserve"> Income</w:t>
+        <w:t>• Edit, Remove Income</w:t>
       </w:r>
       <w:r>
         <w:br/>
@@ -1425,13 +3183,7 @@
     </w:p>
     <w:p>
       <w:r>
-        <w:t xml:space="preserve">• </w:t>
-      </w:r>
-      <w:r>
-        <w:t>Edit, Remove</w:t>
-      </w:r>
-      <w:r>
-        <w:t xml:space="preserve"> Expense</w:t>
+        <w:t>• Edit, Remove Expense</w:t>
       </w:r>
     </w:p>
     <w:p>
@@ -1520,12 +3272,24 @@
     </w:p>
     <w:p>
       <w:r>
-        <w:t>• Frontend: Blazor</w:t>
-      </w:r>
-    </w:p>
-    <w:p>
-      <w:r>
-        <w:t>• Backend: .NET Core</w:t>
+        <w:t xml:space="preserve">• Frontend: </w:t>
+      </w:r>
+      <w:r>
+        <w:t xml:space="preserve">.Net Core 9.0 + </w:t>
+      </w:r>
+      <w:r>
+        <w:t>Blazor</w:t>
+      </w:r>
+      <w:r>
+        <w:t xml:space="preserve"> Server Pages with MudBlazer UI Components</w:t>
+      </w:r>
+    </w:p>
+    <w:p>
+      <w:r>
+        <w:t xml:space="preserve">• Backend: </w:t>
+      </w:r>
+      <w:r>
+        <w:t>.Net Core 9.0</w:t>
       </w:r>
     </w:p>
     <w:p>
@@ -1538,7 +3302,6 @@
         <w:t>• Database: Microsoft SQL Server</w:t>
       </w:r>
     </w:p>
-    <w:p/>
     <w:sectPr>
       <w:pgSz w:w="12240" w:h="15840"/>
       <w:pgMar w:top="1440" w:right="1800" w:bottom="1440" w:left="1800" w:header="720" w:footer="720" w:gutter="0"/>
@@ -1547,6 +3310,216 @@
     </w:sectPr>
   </w:body>
 </w:document>
+</file>
+
+<file path=word/numbering.xml><?xml version="1.0" encoding="utf-8"?>
+<w:numbering xmlns:wpc="http://schemas.microsoft.com/office/word/2010/wordprocessingCanvas" xmlns:cx="http://schemas.microsoft.com/office/drawing/2014/chartex" xmlns:cx1="http://schemas.microsoft.com/office/drawing/2015/9/8/chartex" xmlns:cx2="http://schemas.microsoft.com/office/drawing/2015/10/21/chartex" xmlns:cx3="http://schemas.microsoft.com/office/drawing/2016/5/9/chartex" xmlns:cx4="http://schemas.microsoft.com/office/drawing/2016/5/10/chartex" xmlns:cx5="http://schemas.microsoft.com/office/drawing/2016/5/11/chartex" xmlns:cx6="http://schemas.microsoft.com/office/drawing/2016/5/12/chartex" xmlns:cx7="http://schemas.microsoft.com/office/drawing/2016/5/13/chartex" xmlns:cx8="http://schemas.microsoft.com/office/drawing/2016/5/14/chartex" xmlns:mc="http://schemas.openxmlformats.org/markup-compatibility/2006" xmlns:aink="http://schemas.microsoft.com/office/drawing/2016/ink" xmlns:am3d="http://schemas.microsoft.com/office/drawing/2017/model3d" xmlns:o="urn:schemas-microsoft-com:office:office" xmlns:oel="http://schemas.microsoft.com/office/2019/extlst" xmlns:r="http://schemas.openxmlformats.org/officeDocument/2006/relationships" xmlns:m="http://schemas.openxmlformats.org/officeDocument/2006/math" xmlns:v="urn:schemas-microsoft-com:vml" xmlns:wp14="http://schemas.microsoft.com/office/word/2010/wordprocessingDrawing" xmlns:wp="http://schemas.openxmlformats.org/drawingml/2006/wordprocessingDrawing" xmlns:w10="urn:schemas-microsoft-com:office:word" xmlns:w="http://schemas.openxmlformats.org/wordprocessingml/2006/main" xmlns:w14="http://schemas.microsoft.com/office/word/2010/wordml" xmlns:w15="http://schemas.microsoft.com/office/word/2012/wordml" xmlns:w16cex="http://schemas.microsoft.com/office/word/2018/wordml/cex" xmlns:w16cid="http://schemas.microsoft.com/office/word/2016/wordml/cid" xmlns:w16="http://schemas.microsoft.com/office/word/2018/wordml" xmlns:w16sdtdh="http://schemas.microsoft.com/office/word/2020/wordml/sdtdatahash" xmlns:w16se="http://schemas.microsoft.com/office/word/2015/wordml/symex" xmlns:wpg="http://schemas.microsoft.com/office/word/2010/wordprocessingGroup" xmlns:wpi="http://schemas.microsoft.com/office/word/2010/wordprocessingInk" xmlns:wne="http://schemas.microsoft.com/office/word/2006/wordml" xmlns:wps="http://schemas.microsoft.com/office/word/2010/wordprocessingShape" mc:Ignorable="w14 w15 w16se w16cid w16 w16cex w16sdtdh wp14">
+  <w:abstractNum w:abstractNumId="0" w15:restartNumberingAfterBreak="0">
+    <w:nsid w:val="0DC73CC9"/>
+    <w:multiLevelType w:val="hybridMultilevel"/>
+    <w:tmpl w:val="746A96AC"/>
+    <w:lvl w:ilvl="0" w:tplc="0409000F">
+      <w:start w:val="1"/>
+      <w:numFmt w:val="decimal"/>
+      <w:lvlText w:val="%1."/>
+      <w:lvlJc w:val="left"/>
+      <w:pPr>
+        <w:ind w:left="720" w:hanging="360"/>
+      </w:pPr>
+    </w:lvl>
+    <w:lvl w:ilvl="1" w:tplc="04090019" w:tentative="1">
+      <w:start w:val="1"/>
+      <w:numFmt w:val="lowerLetter"/>
+      <w:lvlText w:val="%2."/>
+      <w:lvlJc w:val="left"/>
+      <w:pPr>
+        <w:ind w:left="1440" w:hanging="360"/>
+      </w:pPr>
+    </w:lvl>
+    <w:lvl w:ilvl="2" w:tplc="0409001B" w:tentative="1">
+      <w:start w:val="1"/>
+      <w:numFmt w:val="lowerRoman"/>
+      <w:lvlText w:val="%3."/>
+      <w:lvlJc w:val="right"/>
+      <w:pPr>
+        <w:ind w:left="2160" w:hanging="180"/>
+      </w:pPr>
+    </w:lvl>
+    <w:lvl w:ilvl="3" w:tplc="0409000F" w:tentative="1">
+      <w:start w:val="1"/>
+      <w:numFmt w:val="decimal"/>
+      <w:lvlText w:val="%4."/>
+      <w:lvlJc w:val="left"/>
+      <w:pPr>
+        <w:ind w:left="2880" w:hanging="360"/>
+      </w:pPr>
+    </w:lvl>
+    <w:lvl w:ilvl="4" w:tplc="04090019" w:tentative="1">
+      <w:start w:val="1"/>
+      <w:numFmt w:val="lowerLetter"/>
+      <w:lvlText w:val="%5."/>
+      <w:lvlJc w:val="left"/>
+      <w:pPr>
+        <w:ind w:left="3600" w:hanging="360"/>
+      </w:pPr>
+    </w:lvl>
+    <w:lvl w:ilvl="5" w:tplc="0409001B" w:tentative="1">
+      <w:start w:val="1"/>
+      <w:numFmt w:val="lowerRoman"/>
+      <w:lvlText w:val="%6."/>
+      <w:lvlJc w:val="right"/>
+      <w:pPr>
+        <w:ind w:left="4320" w:hanging="180"/>
+      </w:pPr>
+    </w:lvl>
+    <w:lvl w:ilvl="6" w:tplc="0409000F" w:tentative="1">
+      <w:start w:val="1"/>
+      <w:numFmt w:val="decimal"/>
+      <w:lvlText w:val="%7."/>
+      <w:lvlJc w:val="left"/>
+      <w:pPr>
+        <w:ind w:left="5040" w:hanging="360"/>
+      </w:pPr>
+    </w:lvl>
+    <w:lvl w:ilvl="7" w:tplc="04090019" w:tentative="1">
+      <w:start w:val="1"/>
+      <w:numFmt w:val="lowerLetter"/>
+      <w:lvlText w:val="%8."/>
+      <w:lvlJc w:val="left"/>
+      <w:pPr>
+        <w:ind w:left="5760" w:hanging="360"/>
+      </w:pPr>
+    </w:lvl>
+    <w:lvl w:ilvl="8" w:tplc="0409001B" w:tentative="1">
+      <w:start w:val="1"/>
+      <w:numFmt w:val="lowerRoman"/>
+      <w:lvlText w:val="%9."/>
+      <w:lvlJc w:val="right"/>
+      <w:pPr>
+        <w:ind w:left="6480" w:hanging="180"/>
+      </w:pPr>
+    </w:lvl>
+  </w:abstractNum>
+  <w:abstractNum w:abstractNumId="1" w15:restartNumberingAfterBreak="0">
+    <w:nsid w:val="28FB5D0B"/>
+    <w:multiLevelType w:val="hybridMultilevel"/>
+    <w:tmpl w:val="A7A4DF6E"/>
+    <w:lvl w:ilvl="0" w:tplc="04090001">
+      <w:start w:val="1"/>
+      <w:numFmt w:val="bullet"/>
+      <w:lvlText w:val=""/>
+      <w:lvlJc w:val="left"/>
+      <w:pPr>
+        <w:ind w:left="720" w:hanging="360"/>
+      </w:pPr>
+      <w:rPr>
+        <w:rFonts w:ascii="Symbol" w:hAnsi="Symbol" w:hint="default"/>
+      </w:rPr>
+    </w:lvl>
+    <w:lvl w:ilvl="1" w:tplc="04090003" w:tentative="1">
+      <w:start w:val="1"/>
+      <w:numFmt w:val="bullet"/>
+      <w:lvlText w:val="o"/>
+      <w:lvlJc w:val="left"/>
+      <w:pPr>
+        <w:ind w:left="1440" w:hanging="360"/>
+      </w:pPr>
+      <w:rPr>
+        <w:rFonts w:ascii="Courier New" w:hAnsi="Courier New" w:cs="Courier New" w:hint="default"/>
+      </w:rPr>
+    </w:lvl>
+    <w:lvl w:ilvl="2" w:tplc="04090005" w:tentative="1">
+      <w:start w:val="1"/>
+      <w:numFmt w:val="bullet"/>
+      <w:lvlText w:val=""/>
+      <w:lvlJc w:val="left"/>
+      <w:pPr>
+        <w:ind w:left="2160" w:hanging="360"/>
+      </w:pPr>
+      <w:rPr>
+        <w:rFonts w:ascii="Wingdings" w:hAnsi="Wingdings" w:hint="default"/>
+      </w:rPr>
+    </w:lvl>
+    <w:lvl w:ilvl="3" w:tplc="04090001" w:tentative="1">
+      <w:start w:val="1"/>
+      <w:numFmt w:val="bullet"/>
+      <w:lvlText w:val=""/>
+      <w:lvlJc w:val="left"/>
+      <w:pPr>
+        <w:ind w:left="2880" w:hanging="360"/>
+      </w:pPr>
+      <w:rPr>
+        <w:rFonts w:ascii="Symbol" w:hAnsi="Symbol" w:hint="default"/>
+      </w:rPr>
+    </w:lvl>
+    <w:lvl w:ilvl="4" w:tplc="04090003" w:tentative="1">
+      <w:start w:val="1"/>
+      <w:numFmt w:val="bullet"/>
+      <w:lvlText w:val="o"/>
+      <w:lvlJc w:val="left"/>
+      <w:pPr>
+        <w:ind w:left="3600" w:hanging="360"/>
+      </w:pPr>
+      <w:rPr>
+        <w:rFonts w:ascii="Courier New" w:hAnsi="Courier New" w:cs="Courier New" w:hint="default"/>
+      </w:rPr>
+    </w:lvl>
+    <w:lvl w:ilvl="5" w:tplc="04090005" w:tentative="1">
+      <w:start w:val="1"/>
+      <w:numFmt w:val="bullet"/>
+      <w:lvlText w:val=""/>
+      <w:lvlJc w:val="left"/>
+      <w:pPr>
+        <w:ind w:left="4320" w:hanging="360"/>
+      </w:pPr>
+      <w:rPr>
+        <w:rFonts w:ascii="Wingdings" w:hAnsi="Wingdings" w:hint="default"/>
+      </w:rPr>
+    </w:lvl>
+    <w:lvl w:ilvl="6" w:tplc="04090001" w:tentative="1">
+      <w:start w:val="1"/>
+      <w:numFmt w:val="bullet"/>
+      <w:lvlText w:val=""/>
+      <w:lvlJc w:val="left"/>
+      <w:pPr>
+        <w:ind w:left="5040" w:hanging="360"/>
+      </w:pPr>
+      <w:rPr>
+        <w:rFonts w:ascii="Symbol" w:hAnsi="Symbol" w:hint="default"/>
+      </w:rPr>
+    </w:lvl>
+    <w:lvl w:ilvl="7" w:tplc="04090003" w:tentative="1">
+      <w:start w:val="1"/>
+      <w:numFmt w:val="bullet"/>
+      <w:lvlText w:val="o"/>
+      <w:lvlJc w:val="left"/>
+      <w:pPr>
+        <w:ind w:left="5760" w:hanging="360"/>
+      </w:pPr>
+      <w:rPr>
+        <w:rFonts w:ascii="Courier New" w:hAnsi="Courier New" w:cs="Courier New" w:hint="default"/>
+      </w:rPr>
+    </w:lvl>
+    <w:lvl w:ilvl="8" w:tplc="04090005" w:tentative="1">
+      <w:start w:val="1"/>
+      <w:numFmt w:val="bullet"/>
+      <w:lvlText w:val=""/>
+      <w:lvlJc w:val="left"/>
+      <w:pPr>
+        <w:ind w:left="6480" w:hanging="360"/>
+      </w:pPr>
+      <w:rPr>
+        <w:rFonts w:ascii="Wingdings" w:hAnsi="Wingdings" w:hint="default"/>
+      </w:rPr>
+    </w:lvl>
+  </w:abstractNum>
+  <w:num w:numId="1" w16cid:durableId="729309544">
+    <w:abstractNumId w:val="1"/>
+  </w:num>
+  <w:num w:numId="2" w16cid:durableId="1342391810">
+    <w:abstractNumId w:val="0"/>
+  </w:num>
+</w:numbering>
 </file>
 
 <file path=word/styles.xml><?xml version="1.0" encoding="utf-8"?>
@@ -2145,6 +4118,40 @@
       </w:tblBorders>
     </w:tblPr>
   </w:style>
+  <w:style w:type="paragraph" w:styleId="NoSpacing">
+    <w:name w:val="No Spacing"/>
+    <w:link w:val="NoSpacingChar"/>
+    <w:uiPriority w:val="1"/>
+    <w:qFormat/>
+    <w:rsid w:val="00320881"/>
+    <w:pPr>
+      <w:spacing w:after="0" w:line="240" w:lineRule="auto"/>
+    </w:pPr>
+    <w:rPr>
+      <w:rFonts w:eastAsiaTheme="minorEastAsia"/>
+    </w:rPr>
+  </w:style>
+  <w:style w:type="character" w:customStyle="1" w:styleId="NoSpacingChar">
+    <w:name w:val="No Spacing Char"/>
+    <w:basedOn w:val="DefaultParagraphFont"/>
+    <w:link w:val="NoSpacing"/>
+    <w:uiPriority w:val="1"/>
+    <w:rsid w:val="00320881"/>
+    <w:rPr>
+      <w:rFonts w:eastAsiaTheme="minorEastAsia"/>
+    </w:rPr>
+  </w:style>
+  <w:style w:type="paragraph" w:styleId="ListParagraph">
+    <w:name w:val="List Paragraph"/>
+    <w:basedOn w:val="Normal"/>
+    <w:uiPriority w:val="34"/>
+    <w:qFormat/>
+    <w:rsid w:val="00BA2C4A"/>
+    <w:pPr>
+      <w:ind w:left="720"/>
+      <w:contextualSpacing/>
+    </w:pPr>
+  </w:style>
 </w:styles>
 </file>
 

</xml_diff>